<commit_message>
update: atualiza layout do template_geral
</commit_message>
<xml_diff>
--- a/template_geral.docx
+++ b/template_geral.docx
@@ -351,13 +351,23 @@
               <w:t>({</w:t>
             </w:r>
             <w:proofErr w:type="spellStart"/>
+            <w:proofErr w:type="gramStart"/>
             <w:r>
               <w:rPr>
                 <w:rFonts w:ascii="Arial" w:eastAsia="Arial" w:hAnsi="Arial" w:cs="Arial"/>
                 <w:b/>
                 <w:bCs/>
               </w:rPr>
-              <w:t>media_rotas</w:t>
+              <w:t>media</w:t>
+            </w:r>
+            <w:proofErr w:type="gramEnd"/>
+            <w:r>
+              <w:rPr>
+                <w:rFonts w:ascii="Arial" w:eastAsia="Arial" w:hAnsi="Arial" w:cs="Arial"/>
+                <w:b/>
+                <w:bCs/>
+              </w:rPr>
+              <w:t>_rotas</w:t>
             </w:r>
             <w:proofErr w:type="spellEnd"/>
             <w:r>
@@ -851,13 +861,23 @@
         <w:t>({</w:t>
       </w:r>
       <w:proofErr w:type="spellStart"/>
-      <w:r>
-        <w:rPr>
-          <w:rFonts w:ascii="Arial" w:eastAsia="Arial" w:hAnsi="Arial" w:cs="Arial"/>
-          <w:b/>
-          <w:bCs/>
-        </w:rPr>
-        <w:t>media_rotas</w:t>
+      <w:proofErr w:type="gramStart"/>
+      <w:r>
+        <w:rPr>
+          <w:rFonts w:ascii="Arial" w:eastAsia="Arial" w:hAnsi="Arial" w:cs="Arial"/>
+          <w:b/>
+          <w:bCs/>
+        </w:rPr>
+        <w:t>media</w:t>
+      </w:r>
+      <w:proofErr w:type="gramEnd"/>
+      <w:r>
+        <w:rPr>
+          <w:rFonts w:ascii="Arial" w:eastAsia="Arial" w:hAnsi="Arial" w:cs="Arial"/>
+          <w:b/>
+          <w:bCs/>
+        </w:rPr>
+        <w:t>_rotas</w:t>
       </w:r>
       <w:proofErr w:type="spellEnd"/>
       <w:r>
@@ -885,7 +905,14 @@
         <w:rPr>
           <w:rFonts w:ascii="Arial" w:eastAsia="Arial" w:hAnsi="Arial" w:cs="Arial"/>
         </w:rPr>
-        <w:t>peso_estatistico</w:t>
+        <w:t>peso_</w:t>
+      </w:r>
+      <w:proofErr w:type="gramStart"/>
+      <w:r>
+        <w:rPr>
+          <w:rFonts w:ascii="Arial" w:eastAsia="Arial" w:hAnsi="Arial" w:cs="Arial"/>
+        </w:rPr>
+        <w:t>estatistico</w:t>
       </w:r>
       <w:proofErr w:type="spellEnd"/>
       <w:r>
@@ -894,6 +921,7 @@
         </w:rPr>
         <w:t>}%</w:t>
       </w:r>
+      <w:proofErr w:type="gramEnd"/>
       <w:r>
         <w:rPr>
           <w:rFonts w:ascii="Arial" w:eastAsia="Arial" w:hAnsi="Arial" w:cs="Arial"/>
@@ -951,42 +979,52 @@
     </w:p>
     <w:p>
       <w:pPr>
-        <w:pStyle w:val="Ttulo3"/>
-        <w:spacing w:before="320" w:line="276" w:lineRule="auto"/>
         <w:rPr>
           <w:rFonts w:asciiTheme="minorHAnsi" w:eastAsia="Arial" w:hAnsiTheme="minorHAnsi" w:cs="Arial"/>
-          <w:color w:val="auto"/>
-          <w:sz w:val="24"/>
-          <w:szCs w:val="24"/>
+          <w:b/>
+          <w:bCs/>
         </w:rPr>
       </w:pPr>
       <w:r>
         <w:rPr>
           <w:rFonts w:asciiTheme="minorHAnsi" w:eastAsia="Arial" w:hAnsiTheme="minorHAnsi" w:cs="Arial"/>
-          <w:color w:val="auto"/>
-          <w:sz w:val="24"/>
-          <w:szCs w:val="24"/>
-        </w:rPr>
-        <w:t>{#meses}</w:t>
-      </w:r>
-    </w:p>
-    <w:p>
-      <w:pPr>
-        <w:pStyle w:val="Ttulo3"/>
-        <w:spacing w:before="320" w:line="276" w:lineRule="auto"/>
+          <w:b/>
+          <w:bCs/>
+        </w:rPr>
+        <w:t>{#meses} {</w:t>
+      </w:r>
+      <w:proofErr w:type="spellStart"/>
+      <w:r>
         <w:rPr>
           <w:rFonts w:asciiTheme="minorHAnsi" w:eastAsia="Arial" w:hAnsiTheme="minorHAnsi" w:cs="Arial"/>
-          <w:color w:val="auto"/>
-          <w:sz w:val="24"/>
-          <w:szCs w:val="24"/>
-        </w:rPr>
-      </w:pPr>
+          <w:b/>
+          <w:bCs/>
+        </w:rPr>
+        <w:t>mes</w:t>
+      </w:r>
+      <w:proofErr w:type="spellEnd"/>
       <w:r>
         <w:rPr>
           <w:rFonts w:asciiTheme="minorHAnsi" w:eastAsia="Arial" w:hAnsiTheme="minorHAnsi" w:cs="Arial"/>
-          <w:color w:val="auto"/>
-          <w:sz w:val="24"/>
-          <w:szCs w:val="24"/>
+          <w:b/>
+          <w:bCs/>
+        </w:rPr>
+        <w:t>} NÚMERO DE OCORRÊNCIAS: </w:t>
+      </w:r>
+    </w:p>
+    <w:p>
+      <w:pPr>
+        <w:rPr>
+          <w:rFonts w:asciiTheme="minorHAnsi" w:eastAsia="Arial" w:hAnsiTheme="minorHAnsi" w:cs="Arial"/>
+          <w:b/>
+          <w:bCs/>
+        </w:rPr>
+      </w:pPr>
+      <w:r>
+        <w:rPr>
+          <w:rFonts w:asciiTheme="minorHAnsi" w:eastAsia="Arial" w:hAnsiTheme="minorHAnsi" w:cs="Arial"/>
+          <w:b/>
+          <w:bCs/>
         </w:rPr>
         <w:t>{</w:t>
       </w:r>
@@ -994,9 +1032,78 @@
       <w:r>
         <w:rPr>
           <w:rFonts w:asciiTheme="minorHAnsi" w:eastAsia="Arial" w:hAnsiTheme="minorHAnsi" w:cs="Arial"/>
-          <w:color w:val="auto"/>
-          <w:sz w:val="24"/>
-          <w:szCs w:val="24"/>
+          <w:b/>
+          <w:bCs/>
+        </w:rPr>
+        <w:t>ocorrencias</w:t>
+      </w:r>
+      <w:proofErr w:type="spellEnd"/>
+      <w:r>
+        <w:rPr>
+          <w:rFonts w:asciiTheme="minorHAnsi" w:eastAsia="Arial" w:hAnsiTheme="minorHAnsi" w:cs="Arial"/>
+          <w:b/>
+          <w:bCs/>
+        </w:rPr>
+        <w:t>} OCORRÊNCIA GERAL: </w:t>
+      </w:r>
+    </w:p>
+    <w:p>
+      <w:pPr>
+        <w:rPr>
+          <w:rFonts w:asciiTheme="minorHAnsi" w:eastAsia="Arial" w:hAnsiTheme="minorHAnsi" w:cs="Arial"/>
+          <w:b/>
+          <w:bCs/>
+        </w:rPr>
+      </w:pPr>
+      <w:r>
+        <w:rPr>
+          <w:rFonts w:asciiTheme="minorHAnsi" w:eastAsia="Arial" w:hAnsiTheme="minorHAnsi" w:cs="Arial"/>
+          <w:b/>
+          <w:bCs/>
+        </w:rPr>
+        <w:t>{meta} Classificação: {</w:t>
+      </w:r>
+      <w:proofErr w:type="spellStart"/>
+      <w:r>
+        <w:rPr>
+          <w:rFonts w:asciiTheme="minorHAnsi" w:eastAsia="Arial" w:hAnsiTheme="minorHAnsi" w:cs="Arial"/>
+          <w:b/>
+          <w:bCs/>
+        </w:rPr>
+        <w:t>nivel</w:t>
+      </w:r>
+      <w:proofErr w:type="spellEnd"/>
+      <w:r>
+        <w:rPr>
+          <w:rFonts w:asciiTheme="minorHAnsi" w:eastAsia="Arial" w:hAnsiTheme="minorHAnsi" w:cs="Arial"/>
+          <w:b/>
+          <w:bCs/>
+        </w:rPr>
+        <w:t>}</w:t>
+      </w:r>
+    </w:p>
+    <w:p>
+      <w:pPr>
+        <w:rPr>
+          <w:rFonts w:asciiTheme="minorHAnsi" w:eastAsia="Arial" w:hAnsiTheme="minorHAnsi" w:cs="Arial"/>
+          <w:b/>
+          <w:bCs/>
+        </w:rPr>
+      </w:pPr>
+      <w:r>
+        <w:rPr>
+          <w:rFonts w:asciiTheme="minorHAnsi" w:eastAsia="Arial" w:hAnsiTheme="minorHAnsi" w:cs="Arial"/>
+          <w:b/>
+          <w:bCs/>
+        </w:rPr>
+        <w:t>DETALHAMENTO DE OCORRÊNCIAS: {</w:t>
+      </w:r>
+      <w:proofErr w:type="spellStart"/>
+      <w:r>
+        <w:rPr>
+          <w:rFonts w:asciiTheme="minorHAnsi" w:eastAsia="Arial" w:hAnsiTheme="minorHAnsi" w:cs="Arial"/>
+          <w:b/>
+          <w:bCs/>
         </w:rPr>
         <w:t>mes</w:t>
       </w:r>
@@ -1004,116 +1111,161 @@
       <w:r>
         <w:rPr>
           <w:rFonts w:asciiTheme="minorHAnsi" w:eastAsia="Arial" w:hAnsiTheme="minorHAnsi" w:cs="Arial"/>
-          <w:color w:val="auto"/>
-          <w:sz w:val="24"/>
-          <w:szCs w:val="24"/>
-        </w:rPr>
-        <w:t>} OCORRÊNCIA GERAL: {meta}%</w:t>
-      </w:r>
-    </w:p>
-    <w:p>
-      <w:pPr>
-        <w:pStyle w:val="Ttulo3"/>
-        <w:spacing w:before="320" w:line="276" w:lineRule="auto"/>
-        <w:rPr>
-          <w:rFonts w:asciiTheme="minorHAnsi" w:eastAsia="Arial" w:hAnsiTheme="minorHAnsi" w:cs="Arial"/>
-          <w:color w:val="auto"/>
-          <w:sz w:val="24"/>
-          <w:szCs w:val="24"/>
-        </w:rPr>
-      </w:pPr>
-      <w:r>
-        <w:rPr>
-          <w:rFonts w:asciiTheme="minorHAnsi" w:eastAsia="Arial" w:hAnsiTheme="minorHAnsi" w:cs="Arial"/>
-          <w:color w:val="auto"/>
-          <w:sz w:val="24"/>
-          <w:szCs w:val="24"/>
-        </w:rPr>
-        <w:t>Classificação: {</w:t>
-      </w:r>
-      <w:proofErr w:type="spellStart"/>
-      <w:r>
-        <w:rPr>
-          <w:rFonts w:asciiTheme="minorHAnsi" w:eastAsia="Arial" w:hAnsiTheme="minorHAnsi" w:cs="Arial"/>
-          <w:color w:val="auto"/>
-          <w:sz w:val="24"/>
-          <w:szCs w:val="24"/>
-        </w:rPr>
-        <w:t>nivel</w:t>
-      </w:r>
-      <w:proofErr w:type="spellEnd"/>
-      <w:r>
-        <w:rPr>
-          <w:rFonts w:asciiTheme="minorHAnsi" w:eastAsia="Arial" w:hAnsiTheme="minorHAnsi" w:cs="Arial"/>
-          <w:color w:val="auto"/>
-          <w:sz w:val="24"/>
-          <w:szCs w:val="24"/>
+          <w:b/>
+          <w:bCs/>
         </w:rPr>
         <w:t>}</w:t>
       </w:r>
     </w:p>
-    <w:p>
-      <w:pPr>
-        <w:pStyle w:val="Ttulo3"/>
-        <w:spacing w:before="320" w:line="276" w:lineRule="auto"/>
-        <w:rPr>
-          <w:rFonts w:asciiTheme="minorHAnsi" w:eastAsia="Arial" w:hAnsiTheme="minorHAnsi" w:cs="Arial"/>
-          <w:color w:val="auto"/>
-          <w:sz w:val="24"/>
-          <w:szCs w:val="24"/>
-        </w:rPr>
-      </w:pPr>
-      <w:r>
-        <w:rPr>
-          <w:rFonts w:asciiTheme="minorHAnsi" w:eastAsia="Arial" w:hAnsiTheme="minorHAnsi" w:cs="Arial"/>
-          <w:color w:val="auto"/>
-          <w:sz w:val="24"/>
-          <w:szCs w:val="24"/>
-        </w:rPr>
-        <w:t>QUANTIDADE DE OCORRÊNCIA: {</w:t>
-      </w:r>
-      <w:proofErr w:type="spellStart"/>
-      <w:r>
-        <w:rPr>
-          <w:rFonts w:asciiTheme="minorHAnsi" w:eastAsia="Arial" w:hAnsiTheme="minorHAnsi" w:cs="Arial"/>
-          <w:color w:val="auto"/>
-          <w:sz w:val="24"/>
-          <w:szCs w:val="24"/>
-        </w:rPr>
-        <w:t>ocorrencias</w:t>
-      </w:r>
-      <w:proofErr w:type="spellEnd"/>
-      <w:r>
-        <w:rPr>
-          <w:rFonts w:asciiTheme="minorHAnsi" w:eastAsia="Arial" w:hAnsiTheme="minorHAnsi" w:cs="Arial"/>
-          <w:color w:val="auto"/>
-          <w:sz w:val="24"/>
-          <w:szCs w:val="24"/>
-        </w:rPr>
-        <w:t>}</w:t>
-      </w:r>
-    </w:p>
-    <w:p>
-      <w:pPr>
-        <w:pStyle w:val="Ttulo3"/>
-        <w:spacing w:before="320" w:line="276" w:lineRule="auto"/>
-        <w:rPr>
-          <w:rFonts w:asciiTheme="minorHAnsi" w:eastAsia="Arial" w:hAnsiTheme="minorHAnsi" w:cs="Arial"/>
-          <w:b/>
-          <w:bCs/>
-          <w:color w:val="auto"/>
-          <w:sz w:val="24"/>
-          <w:szCs w:val="24"/>
-        </w:rPr>
-      </w:pPr>
-      <w:r>
-        <w:rPr>
-          <w:rFonts w:asciiTheme="minorHAnsi" w:eastAsia="Arial" w:hAnsiTheme="minorHAnsi" w:cs="Arial"/>
-          <w:color w:val="auto"/>
-          <w:sz w:val="24"/>
-          <w:szCs w:val="24"/>
-        </w:rPr>
-        <w:t>{/meses}</w:t>
+    <w:p/>
+    <w:tbl>
+      <w:tblPr>
+        <w:tblStyle w:val="Tabelacomgrade"/>
+        <w:tblW w:w="0" w:type="auto"/>
+        <w:tblLook w:val="04A0" w:firstRow="1" w:lastRow="0" w:firstColumn="1" w:lastColumn="0" w:noHBand="0" w:noVBand="1"/>
+      </w:tblPr>
+      <w:tblGrid>
+        <w:gridCol w:w="2715"/>
+        <w:gridCol w:w="1478"/>
+        <w:gridCol w:w="1631"/>
+        <w:gridCol w:w="2670"/>
+      </w:tblGrid>
+      <w:tr>
+        <w:tc>
+          <w:tcPr>
+            <w:tcW w:w="2715" w:type="dxa"/>
+            <w:vAlign w:val="center"/>
+          </w:tcPr>
+          <w:p>
+            <w:r>
+              <w:t>DATA</w:t>
+            </w:r>
+          </w:p>
+        </w:tc>
+        <w:tc>
+          <w:tcPr>
+            <w:tcW w:w="1478" w:type="dxa"/>
+            <w:vAlign w:val="center"/>
+          </w:tcPr>
+          <w:p>
+            <w:r>
+              <w:t>LINHA/ROTA</w:t>
+            </w:r>
+          </w:p>
+        </w:tc>
+        <w:tc>
+          <w:tcPr>
+            <w:tcW w:w="1631" w:type="dxa"/>
+            <w:vAlign w:val="center"/>
+          </w:tcPr>
+          <w:p>
+            <w:r>
+              <w:t>DESC. OCORRÊNCIA</w:t>
+            </w:r>
+          </w:p>
+        </w:tc>
+        <w:tc>
+          <w:tcPr>
+            <w:tcW w:w="2670" w:type="dxa"/>
+            <w:vAlign w:val="center"/>
+          </w:tcPr>
+          <w:p>
+            <w:r>
+              <w:t>STATUS/RESOLUÇÃO</w:t>
+            </w:r>
+          </w:p>
+        </w:tc>
+      </w:tr>
+      <w:tr>
+        <w:tc>
+          <w:tcPr>
+            <w:tcW w:w="2715" w:type="dxa"/>
+            <w:vAlign w:val="center"/>
+          </w:tcPr>
+          <w:p>
+            <w:r>
+              <w:t>{#lista_ocorrencias_mes}</w:t>
+            </w:r>
+            <w:r>
+              <w:br/>
+              <w:t>{data}</w:t>
+            </w:r>
+          </w:p>
+        </w:tc>
+        <w:tc>
+          <w:tcPr>
+            <w:tcW w:w="1478" w:type="dxa"/>
+            <w:vAlign w:val="center"/>
+          </w:tcPr>
+          <w:p>
+            <w:r>
+              <w:t>{</w:t>
+            </w:r>
+            <w:proofErr w:type="spellStart"/>
+            <w:r>
+              <w:t>linha_rota</w:t>
+            </w:r>
+            <w:proofErr w:type="spellEnd"/>
+            <w:r>
+              <w:t>}</w:t>
+            </w:r>
+          </w:p>
+        </w:tc>
+        <w:tc>
+          <w:tcPr>
+            <w:tcW w:w="1631" w:type="dxa"/>
+            <w:vAlign w:val="center"/>
+          </w:tcPr>
+          <w:p>
+            <w:r>
+              <w:t>{</w:t>
+            </w:r>
+            <w:proofErr w:type="spellStart"/>
+            <w:r>
+              <w:t>descricao</w:t>
+            </w:r>
+            <w:proofErr w:type="spellEnd"/>
+            <w:r>
+              <w:t>}</w:t>
+            </w:r>
+          </w:p>
+        </w:tc>
+        <w:tc>
+          <w:tcPr>
+            <w:tcW w:w="2670" w:type="dxa"/>
+            <w:vAlign w:val="center"/>
+          </w:tcPr>
+          <w:p>
+            <w:r>
+              <w:t>{status}</w:t>
+            </w:r>
+            <w:r>
+              <w:br/>
+              <w:t>{/</w:t>
+            </w:r>
+            <w:proofErr w:type="spellStart"/>
+            <w:r>
+              <w:t>lista_ocorrencias_mes</w:t>
+            </w:r>
+            <w:proofErr w:type="spellEnd"/>
+            <w:r>
+              <w:t>}</w:t>
+            </w:r>
+          </w:p>
+        </w:tc>
+      </w:tr>
+    </w:tbl>
+    <w:p>
+      <w:r>
+        <w:t>**`{/</w:t>
+      </w:r>
+      <w:proofErr w:type="gramStart"/>
+      <w:r>
+        <w:t>meses}`</w:t>
+      </w:r>
+      <w:proofErr w:type="gramEnd"/>
+      <w:r>
+        <w:t>**</w:t>
       </w:r>
     </w:p>
     <w:sectPr>
@@ -1838,7 +1990,6 @@
   <w:style w:type="character" w:default="1" w:styleId="Fontepargpadro">
     <w:name w:val="Default Paragraph Font"/>
     <w:uiPriority w:val="1"/>
-    <w:semiHidden/>
     <w:unhideWhenUsed/>
   </w:style>
   <w:style w:type="table" w:default="1" w:styleId="Tabelanormal">
@@ -2258,6 +2409,25 @@
     <w:link w:val="Rodap"/>
     <w:uiPriority w:val="99"/>
     <w:rsid w:val="0009751F"/>
+  </w:style>
+  <w:style w:type="table" w:styleId="Tabelacomgrade">
+    <w:name w:val="Table Grid"/>
+    <w:basedOn w:val="Tabelanormal"/>
+    <w:uiPriority w:val="39"/>
+    <w:rsid w:val="005A7BB1"/>
+    <w:pPr>
+      <w:spacing w:after="0" w:line="240" w:lineRule="auto"/>
+    </w:pPr>
+    <w:tblPr>
+      <w:tblBorders>
+        <w:top w:val="single" w:sz="4" w:space="0" w:color="auto"/>
+        <w:left w:val="single" w:sz="4" w:space="0" w:color="auto"/>
+        <w:bottom w:val="single" w:sz="4" w:space="0" w:color="auto"/>
+        <w:right w:val="single" w:sz="4" w:space="0" w:color="auto"/>
+        <w:insideH w:val="single" w:sz="4" w:space="0" w:color="auto"/>
+        <w:insideV w:val="single" w:sz="4" w:space="0" w:color="auto"/>
+      </w:tblBorders>
+    </w:tblPr>
   </w:style>
 </w:styles>
 </file>

</xml_diff>

<commit_message>
update: atualiza layout do template_geral novamente
</commit_message>
<xml_diff>
--- a/template_geral.docx
+++ b/template_geral.docx
@@ -39,23 +39,7 @@
           <w:b/>
           <w:bCs/>
         </w:rPr>
-        <w:t>{</w:t>
-      </w:r>
-      <w:proofErr w:type="spellStart"/>
-      <w:r>
-        <w:rPr>
-          <w:b/>
-          <w:bCs/>
-        </w:rPr>
-        <w:t>nome_cliente</w:t>
-      </w:r>
-      <w:proofErr w:type="spellEnd"/>
-      <w:r>
-        <w:rPr>
-          <w:b/>
-          <w:bCs/>
-        </w:rPr>
-        <w:t>}</w:t>
+        <w:t>{nome_cliente}</w:t>
       </w:r>
     </w:p>
     <w:p>
@@ -109,15 +93,7 @@
     </w:p>
     <w:p>
       <w:r>
-        <w:t>Escopo: Operação de {rotas} rotas mensais {</w:t>
-      </w:r>
-      <w:proofErr w:type="spellStart"/>
-      <w:r>
-        <w:t>mes</w:t>
-      </w:r>
-      <w:proofErr w:type="spellEnd"/>
-      <w:r>
-        <w:t>}</w:t>
+        <w:t>Escopo: Operação de {rotas} rotas mensais {mes}</w:t>
       </w:r>
     </w:p>
     <w:p>
@@ -348,35 +324,7 @@
                 <w:b/>
                 <w:bCs/>
               </w:rPr>
-              <w:t>({</w:t>
-            </w:r>
-            <w:proofErr w:type="spellStart"/>
-            <w:proofErr w:type="gramStart"/>
-            <w:r>
-              <w:rPr>
-                <w:rFonts w:ascii="Arial" w:eastAsia="Arial" w:hAnsi="Arial" w:cs="Arial"/>
-                <w:b/>
-                <w:bCs/>
-              </w:rPr>
-              <w:t>media</w:t>
-            </w:r>
-            <w:proofErr w:type="gramEnd"/>
-            <w:r>
-              <w:rPr>
-                <w:rFonts w:ascii="Arial" w:eastAsia="Arial" w:hAnsi="Arial" w:cs="Arial"/>
-                <w:b/>
-                <w:bCs/>
-              </w:rPr>
-              <w:t>_rotas</w:t>
-            </w:r>
-            <w:proofErr w:type="spellEnd"/>
-            <w:r>
-              <w:rPr>
-                <w:rFonts w:ascii="Arial" w:eastAsia="Arial" w:hAnsi="Arial" w:cs="Arial"/>
-                <w:b/>
-                <w:bCs/>
-              </w:rPr>
-              <w:t>} rotas)</w:t>
+              <w:t>({media_rotas} rotas)</w:t>
             </w:r>
           </w:p>
         </w:tc>
@@ -486,25 +434,7 @@
                 <w:b/>
                 <w:bCs/>
               </w:rPr>
-              <w:t>Até {</w:t>
-            </w:r>
-            <w:proofErr w:type="spellStart"/>
-            <w:r>
-              <w:rPr>
-                <w:rFonts w:ascii="Arial" w:eastAsia="Arial" w:hAnsi="Arial" w:cs="Arial"/>
-                <w:b/>
-                <w:bCs/>
-              </w:rPr>
-              <w:t>tolerancia_ocorrencias</w:t>
-            </w:r>
-            <w:proofErr w:type="spellEnd"/>
-            <w:r>
-              <w:rPr>
-                <w:rFonts w:ascii="Arial" w:eastAsia="Arial" w:hAnsi="Arial" w:cs="Arial"/>
-                <w:b/>
-                <w:bCs/>
-              </w:rPr>
-              <w:t>} ocorrências</w:t>
+              <w:t>Até {tolerancia_ocorrencias} ocorrências</w:t>
             </w:r>
           </w:p>
         </w:tc>
@@ -614,25 +544,7 @@
                 <w:b/>
                 <w:bCs/>
               </w:rPr>
-              <w:t>Até {</w:t>
-            </w:r>
-            <w:proofErr w:type="spellStart"/>
-            <w:r>
-              <w:rPr>
-                <w:rFonts w:ascii="Arial" w:eastAsia="Arial" w:hAnsi="Arial" w:cs="Arial"/>
-                <w:b/>
-                <w:bCs/>
-              </w:rPr>
-              <w:t>meta_ocorrencias</w:t>
-            </w:r>
-            <w:proofErr w:type="spellEnd"/>
-            <w:r>
-              <w:rPr>
-                <w:rFonts w:ascii="Arial" w:eastAsia="Arial" w:hAnsi="Arial" w:cs="Arial"/>
-                <w:b/>
-                <w:bCs/>
-              </w:rPr>
-              <w:t>} ocorrências</w:t>
+              <w:t>Até {meta_ocorrencias} ocorrências</w:t>
             </w:r>
           </w:p>
         </w:tc>
@@ -746,25 +658,7 @@
           <w:b/>
           <w:bCs/>
         </w:rPr>
-        <w:t xml:space="preserve">Padrões de </w:t>
-      </w:r>
-      <w:proofErr w:type="spellStart"/>
-      <w:r>
-        <w:rPr>
-          <w:rFonts w:ascii="Arial" w:eastAsia="Arial" w:hAnsi="Arial" w:cs="Arial"/>
-          <w:b/>
-          <w:bCs/>
-        </w:rPr>
-        <w:t>Procurement</w:t>
-      </w:r>
-      <w:proofErr w:type="spellEnd"/>
-      <w:r>
-        <w:rPr>
-          <w:rFonts w:ascii="Arial" w:eastAsia="Arial" w:hAnsi="Arial" w:cs="Arial"/>
-          <w:b/>
-          <w:bCs/>
-        </w:rPr>
-        <w:t xml:space="preserve"> Corporativo (SLA):</w:t>
+        <w:t>Padrões de Procurement Corporativo (SLA):</w:t>
       </w:r>
       <w:r>
         <w:rPr>
@@ -858,35 +752,7 @@
           <w:b/>
           <w:bCs/>
         </w:rPr>
-        <w:t>({</w:t>
-      </w:r>
-      <w:proofErr w:type="spellStart"/>
-      <w:proofErr w:type="gramStart"/>
-      <w:r>
-        <w:rPr>
-          <w:rFonts w:ascii="Arial" w:eastAsia="Arial" w:hAnsi="Arial" w:cs="Arial"/>
-          <w:b/>
-          <w:bCs/>
-        </w:rPr>
-        <w:t>media</w:t>
-      </w:r>
-      <w:proofErr w:type="gramEnd"/>
-      <w:r>
-        <w:rPr>
-          <w:rFonts w:ascii="Arial" w:eastAsia="Arial" w:hAnsi="Arial" w:cs="Arial"/>
-          <w:b/>
-          <w:bCs/>
-        </w:rPr>
-        <w:t>_rotas</w:t>
-      </w:r>
-      <w:proofErr w:type="spellEnd"/>
-      <w:r>
-        <w:rPr>
-          <w:rFonts w:ascii="Arial" w:eastAsia="Arial" w:hAnsi="Arial" w:cs="Arial"/>
-          <w:b/>
-          <w:bCs/>
-        </w:rPr>
-        <w:t>} rotas)</w:t>
+        <w:t>({media_rotas} rotas)</w:t>
       </w:r>
       <w:r>
         <w:rPr>
@@ -898,30 +764,8 @@
         <w:rPr>
           <w:rFonts w:ascii="Arial" w:eastAsia="Arial" w:hAnsi="Arial" w:cs="Arial"/>
         </w:rPr>
-        <w:t>{</w:t>
-      </w:r>
-      <w:proofErr w:type="spellStart"/>
-      <w:r>
-        <w:rPr>
-          <w:rFonts w:ascii="Arial" w:eastAsia="Arial" w:hAnsi="Arial" w:cs="Arial"/>
-        </w:rPr>
-        <w:t>peso_</w:t>
-      </w:r>
-      <w:proofErr w:type="gramStart"/>
-      <w:r>
-        <w:rPr>
-          <w:rFonts w:ascii="Arial" w:eastAsia="Arial" w:hAnsi="Arial" w:cs="Arial"/>
-        </w:rPr>
-        <w:t>estatistico</w:t>
-      </w:r>
-      <w:proofErr w:type="spellEnd"/>
-      <w:r>
-        <w:rPr>
-          <w:rFonts w:ascii="Arial" w:eastAsia="Arial" w:hAnsi="Arial" w:cs="Arial"/>
-        </w:rPr>
-        <w:t>}%</w:t>
-      </w:r>
-      <w:proofErr w:type="gramEnd"/>
+        <w:t>{peso_estatistico}%</w:t>
+      </w:r>
       <w:r>
         <w:rPr>
           <w:rFonts w:ascii="Arial" w:eastAsia="Arial" w:hAnsi="Arial" w:cs="Arial"/>
@@ -931,36 +775,6 @@
     </w:p>
     <w:p>
       <w:pPr>
-        <w:spacing w:before="240" w:after="240"/>
-      </w:pPr>
-    </w:p>
-    <w:p>
-      <w:pPr>
-        <w:spacing w:before="240" w:after="240"/>
-      </w:pPr>
-    </w:p>
-    <w:p>
-      <w:pPr>
-        <w:spacing w:before="240" w:after="240"/>
-      </w:pPr>
-    </w:p>
-    <w:p>
-      <w:pPr>
-        <w:spacing w:before="240" w:after="240"/>
-      </w:pPr>
-    </w:p>
-    <w:p>
-      <w:pPr>
-        <w:spacing w:before="240" w:after="240"/>
-      </w:pPr>
-    </w:p>
-    <w:p>
-      <w:pPr>
-        <w:spacing w:before="240" w:after="240"/>
-      </w:pPr>
-    </w:p>
-    <w:p>
-      <w:pPr>
         <w:spacing w:after="240" w:line="276" w:lineRule="auto"/>
         <w:rPr>
           <w:rFonts w:ascii="Arial" w:eastAsia="Arial" w:hAnsi="Arial" w:cs="Arial"/>
@@ -991,25 +805,24 @@
           <w:b/>
           <w:bCs/>
         </w:rPr>
-        <w:t>{#meses} {</w:t>
-      </w:r>
-      <w:proofErr w:type="spellStart"/>
-      <w:r>
+        <w:t>{#meses} {mes} </w:t>
+      </w:r>
+    </w:p>
+    <w:p>
+      <w:pPr>
         <w:rPr>
           <w:rFonts w:asciiTheme="minorHAnsi" w:eastAsia="Arial" w:hAnsiTheme="minorHAnsi" w:cs="Arial"/>
           <w:b/>
           <w:bCs/>
         </w:rPr>
-        <w:t>mes</w:t>
-      </w:r>
-      <w:proofErr w:type="spellEnd"/>
+      </w:pPr>
       <w:r>
         <w:rPr>
           <w:rFonts w:asciiTheme="minorHAnsi" w:eastAsia="Arial" w:hAnsiTheme="minorHAnsi" w:cs="Arial"/>
           <w:b/>
           <w:bCs/>
         </w:rPr>
-        <w:t>} NÚMERO DE OCORRÊNCIAS: </w:t>
+        <w:t>NÚMERO DE OCORRÊNCIAS: {ocorrencias} </w:t>
       </w:r>
     </w:p>
     <w:p>
@@ -1026,25 +839,24 @@
           <w:b/>
           <w:bCs/>
         </w:rPr>
-        <w:t>{</w:t>
-      </w:r>
-      <w:proofErr w:type="spellStart"/>
-      <w:r>
+        <w:t>OCORRÊNCIA GERAL: </w:t>
+      </w:r>
+    </w:p>
+    <w:p>
+      <w:pPr>
         <w:rPr>
           <w:rFonts w:asciiTheme="minorHAnsi" w:eastAsia="Arial" w:hAnsiTheme="minorHAnsi" w:cs="Arial"/>
           <w:b/>
           <w:bCs/>
         </w:rPr>
-        <w:t>ocorrencias</w:t>
-      </w:r>
-      <w:proofErr w:type="spellEnd"/>
+      </w:pPr>
       <w:r>
         <w:rPr>
           <w:rFonts w:asciiTheme="minorHAnsi" w:eastAsia="Arial" w:hAnsiTheme="minorHAnsi" w:cs="Arial"/>
           <w:b/>
           <w:bCs/>
         </w:rPr>
-        <w:t>} OCORRÊNCIA GERAL: </w:t>
+        <w:t>{meta} Classificação: {nivel}</w:t>
       </w:r>
     </w:p>
     <w:p>
@@ -1061,60 +873,7 @@
           <w:b/>
           <w:bCs/>
         </w:rPr>
-        <w:t>{meta} Classificação: {</w:t>
-      </w:r>
-      <w:proofErr w:type="spellStart"/>
-      <w:r>
-        <w:rPr>
-          <w:rFonts w:asciiTheme="minorHAnsi" w:eastAsia="Arial" w:hAnsiTheme="minorHAnsi" w:cs="Arial"/>
-          <w:b/>
-          <w:bCs/>
-        </w:rPr>
-        <w:t>nivel</w:t>
-      </w:r>
-      <w:proofErr w:type="spellEnd"/>
-      <w:r>
-        <w:rPr>
-          <w:rFonts w:asciiTheme="minorHAnsi" w:eastAsia="Arial" w:hAnsiTheme="minorHAnsi" w:cs="Arial"/>
-          <w:b/>
-          <w:bCs/>
-        </w:rPr>
-        <w:t>}</w:t>
-      </w:r>
-    </w:p>
-    <w:p>
-      <w:pPr>
-        <w:rPr>
-          <w:rFonts w:asciiTheme="minorHAnsi" w:eastAsia="Arial" w:hAnsiTheme="minorHAnsi" w:cs="Arial"/>
-          <w:b/>
-          <w:bCs/>
-        </w:rPr>
-      </w:pPr>
-      <w:r>
-        <w:rPr>
-          <w:rFonts w:asciiTheme="minorHAnsi" w:eastAsia="Arial" w:hAnsiTheme="minorHAnsi" w:cs="Arial"/>
-          <w:b/>
-          <w:bCs/>
-        </w:rPr>
-        <w:t>DETALHAMENTO DE OCORRÊNCIAS: {</w:t>
-      </w:r>
-      <w:proofErr w:type="spellStart"/>
-      <w:r>
-        <w:rPr>
-          <w:rFonts w:asciiTheme="minorHAnsi" w:eastAsia="Arial" w:hAnsiTheme="minorHAnsi" w:cs="Arial"/>
-          <w:b/>
-          <w:bCs/>
-        </w:rPr>
-        <w:t>mes</w:t>
-      </w:r>
-      <w:proofErr w:type="spellEnd"/>
-      <w:r>
-        <w:rPr>
-          <w:rFonts w:asciiTheme="minorHAnsi" w:eastAsia="Arial" w:hAnsiTheme="minorHAnsi" w:cs="Arial"/>
-          <w:b/>
-          <w:bCs/>
-        </w:rPr>
-        <w:t>}</w:t>
+        <w:t>DETALHAMENTO DE OCORRÊNCIAS: {mes}</w:t>
       </w:r>
     </w:p>
     <w:p/>
@@ -1199,15 +958,7 @@
           </w:tcPr>
           <w:p>
             <w:r>
-              <w:t>{</w:t>
-            </w:r>
-            <w:proofErr w:type="spellStart"/>
-            <w:r>
-              <w:t>linha_rota</w:t>
-            </w:r>
-            <w:proofErr w:type="spellEnd"/>
-            <w:r>
-              <w:t>}</w:t>
+              <w:t>{linha_rota}</w:t>
             </w:r>
           </w:p>
         </w:tc>
@@ -1218,15 +969,7 @@
           </w:tcPr>
           <w:p>
             <w:r>
-              <w:t>{</w:t>
-            </w:r>
-            <w:proofErr w:type="spellStart"/>
-            <w:r>
-              <w:t>descricao</w:t>
-            </w:r>
-            <w:proofErr w:type="spellEnd"/>
-            <w:r>
-              <w:t>}</w:t>
+              <w:t>{descricao}</w:t>
             </w:r>
           </w:p>
         </w:tc>
@@ -1241,31 +984,16 @@
             </w:r>
             <w:r>
               <w:br/>
-              <w:t>{/</w:t>
-            </w:r>
-            <w:proofErr w:type="spellStart"/>
-            <w:r>
-              <w:t>lista_ocorrencias_mes</w:t>
-            </w:r>
-            <w:proofErr w:type="spellEnd"/>
-            <w:r>
-              <w:t>}</w:t>
+              <w:t>{/lista_ocorrencias_mes}</w:t>
             </w:r>
           </w:p>
         </w:tc>
       </w:tr>
     </w:tbl>
-    <w:p>
-      <w:r>
-        <w:t>**`{/</w:t>
-      </w:r>
-      <w:proofErr w:type="gramStart"/>
-      <w:r>
-        <w:t>meses}`</w:t>
-      </w:r>
-      <w:proofErr w:type="gramEnd"/>
-      <w:r>
-        <w:t>**</w:t>
+    <w:p/>
+    <w:p>
+      <w:r>
+        <w:t>{/meses}`**</w:t>
       </w:r>
     </w:p>
     <w:sectPr>
@@ -1990,6 +1718,7 @@
   <w:style w:type="character" w:default="1" w:styleId="Fontepargpadro">
     <w:name w:val="Default Paragraph Font"/>
     <w:uiPriority w:val="1"/>
+    <w:semiHidden/>
     <w:unhideWhenUsed/>
   </w:style>
   <w:style w:type="table" w:default="1" w:styleId="Tabelanormal">

</xml_diff>

<commit_message>
update: atualiza layout do template_geral mais uma vez
</commit_message>
<xml_diff>
--- a/template_geral.docx
+++ b/template_geral.docx
@@ -5,6 +5,7 @@
     <w:p>
       <w:pPr>
         <w:rPr>
+          <w:rFonts w:ascii="Arial" w:hAnsi="Arial" w:cs="Arial"/>
           <w:b/>
           <w:bCs/>
         </w:rPr>
@@ -14,6 +15,7 @@
       <w:pPr>
         <w:jc w:val="center"/>
         <w:rPr>
+          <w:rFonts w:ascii="Arial" w:hAnsi="Arial" w:cs="Arial"/>
           <w:b/>
           <w:bCs/>
         </w:rPr>
@@ -23,12 +25,14 @@
       <w:pPr>
         <w:jc w:val="center"/>
         <w:rPr>
-          <w:b/>
-          <w:bCs/>
-        </w:rPr>
-      </w:pPr>
-      <w:r>
-        <w:rPr>
+          <w:rFonts w:ascii="Arial" w:hAnsi="Arial" w:cs="Arial"/>
+          <w:b/>
+          <w:bCs/>
+        </w:rPr>
+      </w:pPr>
+      <w:r>
+        <w:rPr>
+          <w:rFonts w:ascii="Arial" w:hAnsi="Arial" w:cs="Arial"/>
           <w:b/>
           <w:bCs/>
         </w:rPr>
@@ -36,16 +40,36 @@
       </w:r>
       <w:r>
         <w:rPr>
-          <w:b/>
-          <w:bCs/>
-        </w:rPr>
-        <w:t>{nome_cliente}</w:t>
+          <w:rFonts w:ascii="Arial" w:hAnsi="Arial" w:cs="Arial"/>
+          <w:b/>
+          <w:bCs/>
+        </w:rPr>
+        <w:t>{</w:t>
+      </w:r>
+      <w:proofErr w:type="spellStart"/>
+      <w:r>
+        <w:rPr>
+          <w:rFonts w:ascii="Arial" w:hAnsi="Arial" w:cs="Arial"/>
+          <w:b/>
+          <w:bCs/>
+        </w:rPr>
+        <w:t>nome_cliente</w:t>
+      </w:r>
+      <w:proofErr w:type="spellEnd"/>
+      <w:r>
+        <w:rPr>
+          <w:rFonts w:ascii="Arial" w:hAnsi="Arial" w:cs="Arial"/>
+          <w:b/>
+          <w:bCs/>
+        </w:rPr>
+        <w:t>}</w:t>
       </w:r>
     </w:p>
     <w:p>
       <w:pPr>
         <w:jc w:val="center"/>
         <w:rPr>
+          <w:rFonts w:ascii="Arial" w:hAnsi="Arial" w:cs="Arial"/>
           <w:b/>
           <w:bCs/>
           <w:i/>
@@ -54,6 +78,7 @@
       </w:pPr>
       <w:r>
         <w:rPr>
+          <w:rFonts w:ascii="Arial" w:hAnsi="Arial" w:cs="Arial"/>
           <w:b/>
           <w:bCs/>
           <w:i/>
@@ -66,20 +91,23 @@
       <w:pPr>
         <w:jc w:val="center"/>
         <w:rPr>
-          <w:b/>
-          <w:bCs/>
-        </w:rPr>
-      </w:pPr>
-    </w:p>
-    <w:p>
-      <w:pPr>
-        <w:rPr>
-          <w:b/>
-          <w:bCs/>
-        </w:rPr>
-      </w:pPr>
-      <w:r>
-        <w:rPr>
+          <w:rFonts w:ascii="Arial" w:hAnsi="Arial" w:cs="Arial"/>
+          <w:b/>
+          <w:bCs/>
+        </w:rPr>
+      </w:pPr>
+    </w:p>
+    <w:p>
+      <w:pPr>
+        <w:rPr>
+          <w:rFonts w:ascii="Arial" w:hAnsi="Arial" w:cs="Arial"/>
+          <w:b/>
+          <w:bCs/>
+        </w:rPr>
+      </w:pPr>
+      <w:r>
+        <w:rPr>
+          <w:rFonts w:ascii="Arial" w:hAnsi="Arial" w:cs="Arial"/>
           <w:b/>
           <w:bCs/>
         </w:rPr>
@@ -87,21 +115,65 @@
       </w:r>
     </w:p>
     <w:p>
-      <w:r>
+      <w:pPr>
+        <w:rPr>
+          <w:rFonts w:ascii="Arial" w:hAnsi="Arial" w:cs="Arial"/>
+        </w:rPr>
+      </w:pPr>
+      <w:r>
+        <w:rPr>
+          <w:rFonts w:ascii="Arial" w:hAnsi="Arial" w:cs="Arial"/>
+        </w:rPr>
         <w:t>{#meses}</w:t>
       </w:r>
     </w:p>
     <w:p>
-      <w:r>
-        <w:t>Escopo: Operação de {rotas} rotas mensais {mes}</w:t>
-      </w:r>
-    </w:p>
-    <w:p>
-      <w:r>
+      <w:pPr>
+        <w:rPr>
+          <w:rFonts w:ascii="Arial" w:hAnsi="Arial" w:cs="Arial"/>
+        </w:rPr>
+      </w:pPr>
+      <w:r>
+        <w:rPr>
+          <w:rFonts w:ascii="Arial" w:hAnsi="Arial" w:cs="Arial"/>
+        </w:rPr>
+        <w:t>Escopo: Operação de {rotas} rotas mensais {</w:t>
+      </w:r>
+      <w:proofErr w:type="spellStart"/>
+      <w:r>
+        <w:rPr>
+          <w:rFonts w:ascii="Arial" w:hAnsi="Arial" w:cs="Arial"/>
+        </w:rPr>
+        <w:t>mes</w:t>
+      </w:r>
+      <w:proofErr w:type="spellEnd"/>
+      <w:r>
+        <w:rPr>
+          <w:rFonts w:ascii="Arial" w:hAnsi="Arial" w:cs="Arial"/>
+        </w:rPr>
+        <w:t>}</w:t>
+      </w:r>
+    </w:p>
+    <w:p>
+      <w:pPr>
+        <w:rPr>
+          <w:rFonts w:ascii="Arial" w:hAnsi="Arial" w:cs="Arial"/>
+        </w:rPr>
+      </w:pPr>
+      <w:r>
+        <w:rPr>
+          <w:rFonts w:ascii="Arial" w:hAnsi="Arial" w:cs="Arial"/>
+        </w:rPr>
         <w:t>{/meses}</w:t>
       </w:r>
     </w:p>
-    <w:p/>
+    <w:p>
+      <w:pPr>
+        <w:rPr>
+          <w:rFonts w:ascii="Arial" w:hAnsi="Arial" w:cs="Arial"/>
+        </w:rPr>
+      </w:pPr>
+    </w:p>
     <w:p>
       <w:pPr>
         <w:spacing w:after="240" w:line="276" w:lineRule="auto"/>
@@ -193,7 +265,7 @@
     <w:tbl>
       <w:tblPr>
         <w:tblStyle w:val="a2"/>
-        <w:tblW w:w="8085" w:type="dxa"/>
+        <w:tblW w:w="8497" w:type="dxa"/>
         <w:tblInd w:w="0" w:type="dxa"/>
         <w:tblBorders>
           <w:top w:val="nil"/>
@@ -209,7 +281,7 @@
       <w:tblGrid>
         <w:gridCol w:w="2940"/>
         <w:gridCol w:w="2400"/>
-        <w:gridCol w:w="2745"/>
+        <w:gridCol w:w="3157"/>
       </w:tblGrid>
       <w:tr>
         <w:trPr>
@@ -287,7 +359,7 @@
         </w:tc>
         <w:tc>
           <w:tcPr>
-            <w:tcW w:w="2745" w:type="dxa"/>
+            <w:tcW w:w="3157" w:type="dxa"/>
             <w:tcBorders>
               <w:top w:val="single" w:sz="6" w:space="0" w:color="000000"/>
               <w:left w:val="single" w:sz="6" w:space="0" w:color="000000"/>
@@ -324,7 +396,35 @@
                 <w:b/>
                 <w:bCs/>
               </w:rPr>
-              <w:t>({media_rotas} rotas)</w:t>
+              <w:t>({</w:t>
+            </w:r>
+            <w:proofErr w:type="spellStart"/>
+            <w:proofErr w:type="gramStart"/>
+            <w:r>
+              <w:rPr>
+                <w:rFonts w:ascii="Arial" w:eastAsia="Arial" w:hAnsi="Arial" w:cs="Arial"/>
+                <w:b/>
+                <w:bCs/>
+              </w:rPr>
+              <w:t>media</w:t>
+            </w:r>
+            <w:proofErr w:type="gramEnd"/>
+            <w:r>
+              <w:rPr>
+                <w:rFonts w:ascii="Arial" w:eastAsia="Arial" w:hAnsi="Arial" w:cs="Arial"/>
+                <w:b/>
+                <w:bCs/>
+              </w:rPr>
+              <w:t>_rotas</w:t>
+            </w:r>
+            <w:proofErr w:type="spellEnd"/>
+            <w:r>
+              <w:rPr>
+                <w:rFonts w:ascii="Arial" w:eastAsia="Arial" w:hAnsi="Arial" w:cs="Arial"/>
+                <w:b/>
+                <w:bCs/>
+              </w:rPr>
+              <w:t>} rotas)</w:t>
             </w:r>
           </w:p>
         </w:tc>
@@ -405,7 +505,7 @@
         </w:tc>
         <w:tc>
           <w:tcPr>
-            <w:tcW w:w="2745" w:type="dxa"/>
+            <w:tcW w:w="3157" w:type="dxa"/>
             <w:tcBorders>
               <w:top w:val="single" w:sz="6" w:space="0" w:color="000000"/>
               <w:left w:val="single" w:sz="6" w:space="0" w:color="000000"/>
@@ -434,7 +534,25 @@
                 <w:b/>
                 <w:bCs/>
               </w:rPr>
-              <w:t>Até {tolerancia_ocorrencias} ocorrências</w:t>
+              <w:t>Até {</w:t>
+            </w:r>
+            <w:proofErr w:type="spellStart"/>
+            <w:r>
+              <w:rPr>
+                <w:rFonts w:ascii="Arial" w:eastAsia="Arial" w:hAnsi="Arial" w:cs="Arial"/>
+                <w:b/>
+                <w:bCs/>
+              </w:rPr>
+              <w:t>tolerancia_ocorrencias</w:t>
+            </w:r>
+            <w:proofErr w:type="spellEnd"/>
+            <w:r>
+              <w:rPr>
+                <w:rFonts w:ascii="Arial" w:eastAsia="Arial" w:hAnsi="Arial" w:cs="Arial"/>
+                <w:b/>
+                <w:bCs/>
+              </w:rPr>
+              <w:t>} ocorrências</w:t>
             </w:r>
           </w:p>
         </w:tc>
@@ -515,7 +633,7 @@
         </w:tc>
         <w:tc>
           <w:tcPr>
-            <w:tcW w:w="2745" w:type="dxa"/>
+            <w:tcW w:w="3157" w:type="dxa"/>
             <w:tcBorders>
               <w:top w:val="single" w:sz="6" w:space="0" w:color="000000"/>
               <w:left w:val="single" w:sz="6" w:space="0" w:color="000000"/>
@@ -544,7 +662,25 @@
                 <w:b/>
                 <w:bCs/>
               </w:rPr>
-              <w:t>Até {meta_ocorrencias} ocorrências</w:t>
+              <w:t>Até {</w:t>
+            </w:r>
+            <w:proofErr w:type="spellStart"/>
+            <w:r>
+              <w:rPr>
+                <w:rFonts w:ascii="Arial" w:eastAsia="Arial" w:hAnsi="Arial" w:cs="Arial"/>
+                <w:b/>
+                <w:bCs/>
+              </w:rPr>
+              <w:t>meta_ocorrencias</w:t>
+            </w:r>
+            <w:proofErr w:type="spellEnd"/>
+            <w:r>
+              <w:rPr>
+                <w:rFonts w:ascii="Arial" w:eastAsia="Arial" w:hAnsi="Arial" w:cs="Arial"/>
+                <w:b/>
+                <w:bCs/>
+              </w:rPr>
+              <w:t>} ocorrências</w:t>
             </w:r>
           </w:p>
         </w:tc>
@@ -575,7 +711,6 @@
           <w:b/>
           <w:bCs/>
         </w:rPr>
-        <w:lastRenderedPageBreak/>
         <w:t>3. FUNDAMENTAÇÃO E FONTES TÉCNICAS</w:t>
       </w:r>
     </w:p>
@@ -592,6 +727,7 @@
         <w:rPr>
           <w:rFonts w:ascii="Arial" w:eastAsia="Arial" w:hAnsi="Arial" w:cs="Arial"/>
         </w:rPr>
+        <w:lastRenderedPageBreak/>
         <w:t>Os indicadores apresentados baseiam-se nos seguintes pilares de governança:</w:t>
       </w:r>
     </w:p>
@@ -658,7 +794,25 @@
           <w:b/>
           <w:bCs/>
         </w:rPr>
-        <w:t>Padrões de Procurement Corporativo (SLA):</w:t>
+        <w:t xml:space="preserve">Padrões de </w:t>
+      </w:r>
+      <w:proofErr w:type="spellStart"/>
+      <w:r>
+        <w:rPr>
+          <w:rFonts w:ascii="Arial" w:eastAsia="Arial" w:hAnsi="Arial" w:cs="Arial"/>
+          <w:b/>
+          <w:bCs/>
+        </w:rPr>
+        <w:t>Procurement</w:t>
+      </w:r>
+      <w:proofErr w:type="spellEnd"/>
+      <w:r>
+        <w:rPr>
+          <w:rFonts w:ascii="Arial" w:eastAsia="Arial" w:hAnsi="Arial" w:cs="Arial"/>
+          <w:b/>
+          <w:bCs/>
+        </w:rPr>
+        <w:t xml:space="preserve"> Corporativo (SLA):</w:t>
       </w:r>
       <w:r>
         <w:rPr>
@@ -752,7 +906,35 @@
           <w:b/>
           <w:bCs/>
         </w:rPr>
-        <w:t>({media_rotas} rotas)</w:t>
+        <w:t>({</w:t>
+      </w:r>
+      <w:proofErr w:type="spellStart"/>
+      <w:proofErr w:type="gramStart"/>
+      <w:r>
+        <w:rPr>
+          <w:rFonts w:ascii="Arial" w:eastAsia="Arial" w:hAnsi="Arial" w:cs="Arial"/>
+          <w:b/>
+          <w:bCs/>
+        </w:rPr>
+        <w:t>media</w:t>
+      </w:r>
+      <w:proofErr w:type="gramEnd"/>
+      <w:r>
+        <w:rPr>
+          <w:rFonts w:ascii="Arial" w:eastAsia="Arial" w:hAnsi="Arial" w:cs="Arial"/>
+          <w:b/>
+          <w:bCs/>
+        </w:rPr>
+        <w:t>_rotas</w:t>
+      </w:r>
+      <w:proofErr w:type="spellEnd"/>
+      <w:r>
+        <w:rPr>
+          <w:rFonts w:ascii="Arial" w:eastAsia="Arial" w:hAnsi="Arial" w:cs="Arial"/>
+          <w:b/>
+          <w:bCs/>
+        </w:rPr>
+        <w:t>} rotas)</w:t>
       </w:r>
       <w:r>
         <w:rPr>
@@ -764,8 +946,30 @@
         <w:rPr>
           <w:rFonts w:ascii="Arial" w:eastAsia="Arial" w:hAnsi="Arial" w:cs="Arial"/>
         </w:rPr>
-        <w:t>{peso_estatistico}%</w:t>
-      </w:r>
+        <w:t>{</w:t>
+      </w:r>
+      <w:proofErr w:type="spellStart"/>
+      <w:r>
+        <w:rPr>
+          <w:rFonts w:ascii="Arial" w:eastAsia="Arial" w:hAnsi="Arial" w:cs="Arial"/>
+        </w:rPr>
+        <w:t>peso_</w:t>
+      </w:r>
+      <w:proofErr w:type="gramStart"/>
+      <w:r>
+        <w:rPr>
+          <w:rFonts w:ascii="Arial" w:eastAsia="Arial" w:hAnsi="Arial" w:cs="Arial"/>
+        </w:rPr>
+        <w:t>estatistico</w:t>
+      </w:r>
+      <w:proofErr w:type="spellEnd"/>
+      <w:r>
+        <w:rPr>
+          <w:rFonts w:ascii="Arial" w:eastAsia="Arial" w:hAnsi="Arial" w:cs="Arial"/>
+        </w:rPr>
+        <w:t>}%</w:t>
+      </w:r>
+      <w:proofErr w:type="gramEnd"/>
       <w:r>
         <w:rPr>
           <w:rFonts w:ascii="Arial" w:eastAsia="Arial" w:hAnsi="Arial" w:cs="Arial"/>
@@ -776,6 +980,16 @@
     <w:p>
       <w:pPr>
         <w:spacing w:after="240" w:line="276" w:lineRule="auto"/>
+        <w:ind w:firstLine="720"/>
+        <w:jc w:val="both"/>
+        <w:rPr>
+          <w:rFonts w:ascii="Arial" w:eastAsia="Arial" w:hAnsi="Arial" w:cs="Arial"/>
+        </w:rPr>
+      </w:pPr>
+    </w:p>
+    <w:p>
+      <w:pPr>
+        <w:spacing w:after="240" w:line="276" w:lineRule="auto"/>
         <w:rPr>
           <w:rFonts w:ascii="Arial" w:eastAsia="Arial" w:hAnsi="Arial" w:cs="Arial"/>
           <w:b/>
@@ -794,142 +1008,253 @@
     <w:p>
       <w:pPr>
         <w:rPr>
-          <w:rFonts w:asciiTheme="minorHAnsi" w:eastAsia="Arial" w:hAnsiTheme="minorHAnsi" w:cs="Arial"/>
-          <w:b/>
-          <w:bCs/>
-        </w:rPr>
-      </w:pPr>
-      <w:r>
-        <w:rPr>
-          <w:rFonts w:asciiTheme="minorHAnsi" w:eastAsia="Arial" w:hAnsiTheme="minorHAnsi" w:cs="Arial"/>
-          <w:b/>
-          <w:bCs/>
-        </w:rPr>
-        <w:t>{#meses} {mes} </w:t>
-      </w:r>
-    </w:p>
-    <w:p>
-      <w:pPr>
-        <w:rPr>
-          <w:rFonts w:asciiTheme="minorHAnsi" w:eastAsia="Arial" w:hAnsiTheme="minorHAnsi" w:cs="Arial"/>
-          <w:b/>
-          <w:bCs/>
-        </w:rPr>
-      </w:pPr>
-      <w:r>
-        <w:rPr>
-          <w:rFonts w:asciiTheme="minorHAnsi" w:eastAsia="Arial" w:hAnsiTheme="minorHAnsi" w:cs="Arial"/>
-          <w:b/>
-          <w:bCs/>
-        </w:rPr>
-        <w:t>NÚMERO DE OCORRÊNCIAS: {ocorrencias} </w:t>
-      </w:r>
-    </w:p>
-    <w:p>
-      <w:pPr>
-        <w:rPr>
-          <w:rFonts w:asciiTheme="minorHAnsi" w:eastAsia="Arial" w:hAnsiTheme="minorHAnsi" w:cs="Arial"/>
-          <w:b/>
-          <w:bCs/>
-        </w:rPr>
-      </w:pPr>
-      <w:r>
-        <w:rPr>
-          <w:rFonts w:asciiTheme="minorHAnsi" w:eastAsia="Arial" w:hAnsiTheme="minorHAnsi" w:cs="Arial"/>
-          <w:b/>
-          <w:bCs/>
-        </w:rPr>
-        <w:t>OCORRÊNCIA GERAL: </w:t>
-      </w:r>
-    </w:p>
-    <w:p>
-      <w:pPr>
-        <w:rPr>
-          <w:rFonts w:asciiTheme="minorHAnsi" w:eastAsia="Arial" w:hAnsiTheme="minorHAnsi" w:cs="Arial"/>
-          <w:b/>
-          <w:bCs/>
-        </w:rPr>
-      </w:pPr>
-      <w:r>
-        <w:rPr>
-          <w:rFonts w:asciiTheme="minorHAnsi" w:eastAsia="Arial" w:hAnsiTheme="minorHAnsi" w:cs="Arial"/>
-          <w:b/>
-          <w:bCs/>
-        </w:rPr>
-        <w:t>{meta} Classificação: {nivel}</w:t>
-      </w:r>
-    </w:p>
-    <w:p>
-      <w:pPr>
-        <w:rPr>
-          <w:rFonts w:asciiTheme="minorHAnsi" w:eastAsia="Arial" w:hAnsiTheme="minorHAnsi" w:cs="Arial"/>
-          <w:b/>
-          <w:bCs/>
-        </w:rPr>
-      </w:pPr>
-      <w:r>
-        <w:rPr>
-          <w:rFonts w:asciiTheme="minorHAnsi" w:eastAsia="Arial" w:hAnsiTheme="minorHAnsi" w:cs="Arial"/>
-          <w:b/>
-          <w:bCs/>
-        </w:rPr>
-        <w:t>DETALHAMENTO DE OCORRÊNCIAS: {mes}</w:t>
-      </w:r>
-    </w:p>
-    <w:p/>
+          <w:rFonts w:ascii="Arial" w:eastAsia="Arial" w:hAnsi="Arial" w:cs="Arial"/>
+          <w:b/>
+          <w:bCs/>
+        </w:rPr>
+      </w:pPr>
+      <w:r>
+        <w:rPr>
+          <w:rFonts w:ascii="Arial" w:eastAsia="Arial" w:hAnsi="Arial" w:cs="Arial"/>
+          <w:b/>
+          <w:bCs/>
+        </w:rPr>
+        <w:t>{#meses} {</w:t>
+      </w:r>
+      <w:proofErr w:type="spellStart"/>
+      <w:r>
+        <w:rPr>
+          <w:rFonts w:ascii="Arial" w:eastAsia="Arial" w:hAnsi="Arial" w:cs="Arial"/>
+          <w:b/>
+          <w:bCs/>
+        </w:rPr>
+        <w:t>mes</w:t>
+      </w:r>
+      <w:proofErr w:type="spellEnd"/>
+      <w:r>
+        <w:rPr>
+          <w:rFonts w:ascii="Arial" w:eastAsia="Arial" w:hAnsi="Arial" w:cs="Arial"/>
+          <w:b/>
+          <w:bCs/>
+        </w:rPr>
+        <w:t>} </w:t>
+      </w:r>
+    </w:p>
+    <w:p>
+      <w:pPr>
+        <w:rPr>
+          <w:rFonts w:ascii="Arial" w:eastAsia="Arial" w:hAnsi="Arial" w:cs="Arial"/>
+          <w:sz w:val="22"/>
+          <w:szCs w:val="22"/>
+        </w:rPr>
+      </w:pPr>
+      <w:r>
+        <w:rPr>
+          <w:rFonts w:ascii="Arial" w:eastAsia="Arial" w:hAnsi="Arial" w:cs="Arial"/>
+          <w:sz w:val="22"/>
+          <w:szCs w:val="22"/>
+        </w:rPr>
+        <w:t>NÚMERO DE OCORRÊNCIAS: {</w:t>
+      </w:r>
+      <w:proofErr w:type="spellStart"/>
+      <w:r>
+        <w:rPr>
+          <w:rFonts w:ascii="Arial" w:eastAsia="Arial" w:hAnsi="Arial" w:cs="Arial"/>
+          <w:sz w:val="22"/>
+          <w:szCs w:val="22"/>
+        </w:rPr>
+        <w:t>ocorrencias</w:t>
+      </w:r>
+      <w:proofErr w:type="spellEnd"/>
+      <w:r>
+        <w:rPr>
+          <w:rFonts w:ascii="Arial" w:eastAsia="Arial" w:hAnsi="Arial" w:cs="Arial"/>
+          <w:sz w:val="22"/>
+          <w:szCs w:val="22"/>
+        </w:rPr>
+        <w:t>} </w:t>
+      </w:r>
+    </w:p>
+    <w:p>
+      <w:pPr>
+        <w:rPr>
+          <w:rFonts w:ascii="Arial" w:eastAsia="Arial" w:hAnsi="Arial" w:cs="Arial"/>
+          <w:sz w:val="22"/>
+          <w:szCs w:val="22"/>
+        </w:rPr>
+      </w:pPr>
+      <w:r>
+        <w:rPr>
+          <w:rFonts w:ascii="Arial" w:eastAsia="Arial" w:hAnsi="Arial" w:cs="Arial"/>
+          <w:sz w:val="22"/>
+          <w:szCs w:val="22"/>
+        </w:rPr>
+        <w:t>OCORRÊNCIA GERAL: {meta} </w:t>
+      </w:r>
+    </w:p>
+    <w:p>
+      <w:pPr>
+        <w:rPr>
+          <w:rFonts w:ascii="Arial" w:eastAsia="Arial" w:hAnsi="Arial" w:cs="Arial"/>
+          <w:sz w:val="22"/>
+          <w:szCs w:val="22"/>
+        </w:rPr>
+      </w:pPr>
+      <w:r>
+        <w:rPr>
+          <w:rFonts w:ascii="Arial" w:eastAsia="Arial" w:hAnsi="Arial" w:cs="Arial"/>
+          <w:sz w:val="22"/>
+          <w:szCs w:val="22"/>
+        </w:rPr>
+        <w:t>Classificação: {</w:t>
+      </w:r>
+      <w:proofErr w:type="spellStart"/>
+      <w:r>
+        <w:rPr>
+          <w:rFonts w:ascii="Arial" w:eastAsia="Arial" w:hAnsi="Arial" w:cs="Arial"/>
+          <w:sz w:val="22"/>
+          <w:szCs w:val="22"/>
+        </w:rPr>
+        <w:t>nivel</w:t>
+      </w:r>
+      <w:proofErr w:type="spellEnd"/>
+      <w:r>
+        <w:rPr>
+          <w:rFonts w:ascii="Arial" w:eastAsia="Arial" w:hAnsi="Arial" w:cs="Arial"/>
+          <w:sz w:val="22"/>
+          <w:szCs w:val="22"/>
+        </w:rPr>
+        <w:t>}</w:t>
+      </w:r>
+    </w:p>
+    <w:p>
+      <w:pPr>
+        <w:rPr>
+          <w:rFonts w:ascii="Arial" w:eastAsia="Arial" w:hAnsi="Arial" w:cs="Arial"/>
+          <w:sz w:val="22"/>
+          <w:szCs w:val="22"/>
+        </w:rPr>
+      </w:pPr>
+      <w:r>
+        <w:rPr>
+          <w:rFonts w:ascii="Arial" w:eastAsia="Arial" w:hAnsi="Arial" w:cs="Arial"/>
+          <w:sz w:val="22"/>
+          <w:szCs w:val="22"/>
+        </w:rPr>
+        <w:t>DETALHAMENTO DE OCORRÊNCIAS: {</w:t>
+      </w:r>
+      <w:proofErr w:type="spellStart"/>
+      <w:r>
+        <w:rPr>
+          <w:rFonts w:ascii="Arial" w:eastAsia="Arial" w:hAnsi="Arial" w:cs="Arial"/>
+          <w:sz w:val="22"/>
+          <w:szCs w:val="22"/>
+        </w:rPr>
+        <w:t>mes</w:t>
+      </w:r>
+      <w:proofErr w:type="spellEnd"/>
+      <w:r>
+        <w:rPr>
+          <w:rFonts w:ascii="Arial" w:eastAsia="Arial" w:hAnsi="Arial" w:cs="Arial"/>
+          <w:sz w:val="22"/>
+          <w:szCs w:val="22"/>
+        </w:rPr>
+        <w:t>}</w:t>
+      </w:r>
+    </w:p>
+    <w:p>
+      <w:pPr>
+        <w:rPr>
+          <w:rFonts w:ascii="Arial" w:hAnsi="Arial" w:cs="Arial"/>
+        </w:rPr>
+      </w:pPr>
+    </w:p>
     <w:tbl>
       <w:tblPr>
         <w:tblStyle w:val="Tabelacomgrade"/>
         <w:tblW w:w="0" w:type="auto"/>
+        <w:tblLayout w:type="fixed"/>
         <w:tblLook w:val="04A0" w:firstRow="1" w:lastRow="0" w:firstColumn="1" w:lastColumn="0" w:noHBand="0" w:noVBand="1"/>
       </w:tblPr>
       <w:tblGrid>
-        <w:gridCol w:w="2715"/>
-        <w:gridCol w:w="1478"/>
-        <w:gridCol w:w="1631"/>
-        <w:gridCol w:w="2670"/>
+        <w:gridCol w:w="1555"/>
+        <w:gridCol w:w="2126"/>
+        <w:gridCol w:w="2207"/>
+        <w:gridCol w:w="2606"/>
       </w:tblGrid>
       <w:tr>
         <w:tc>
           <w:tcPr>
-            <w:tcW w:w="2715" w:type="dxa"/>
+            <w:tcW w:w="1555" w:type="dxa"/>
             <w:vAlign w:val="center"/>
           </w:tcPr>
           <w:p>
-            <w:r>
+            <w:pPr>
+              <w:rPr>
+                <w:rFonts w:ascii="Arial" w:hAnsi="Arial" w:cs="Arial"/>
+              </w:rPr>
+            </w:pPr>
+            <w:r>
+              <w:rPr>
+                <w:rFonts w:ascii="Arial" w:hAnsi="Arial" w:cs="Arial"/>
+              </w:rPr>
               <w:t>DATA</w:t>
             </w:r>
           </w:p>
         </w:tc>
         <w:tc>
           <w:tcPr>
-            <w:tcW w:w="1478" w:type="dxa"/>
+            <w:tcW w:w="2126" w:type="dxa"/>
             <w:vAlign w:val="center"/>
           </w:tcPr>
           <w:p>
-            <w:r>
+            <w:pPr>
+              <w:rPr>
+                <w:rFonts w:ascii="Arial" w:hAnsi="Arial" w:cs="Arial"/>
+              </w:rPr>
+            </w:pPr>
+            <w:r>
+              <w:rPr>
+                <w:rFonts w:ascii="Arial" w:hAnsi="Arial" w:cs="Arial"/>
+              </w:rPr>
               <w:t>LINHA/ROTA</w:t>
             </w:r>
           </w:p>
         </w:tc>
         <w:tc>
           <w:tcPr>
-            <w:tcW w:w="1631" w:type="dxa"/>
+            <w:tcW w:w="2207" w:type="dxa"/>
             <w:vAlign w:val="center"/>
           </w:tcPr>
           <w:p>
-            <w:r>
+            <w:pPr>
+              <w:rPr>
+                <w:rFonts w:ascii="Arial" w:hAnsi="Arial" w:cs="Arial"/>
+              </w:rPr>
+            </w:pPr>
+            <w:r>
+              <w:rPr>
+                <w:rFonts w:ascii="Arial" w:hAnsi="Arial" w:cs="Arial"/>
+              </w:rPr>
               <w:t>DESC. OCORRÊNCIA</w:t>
             </w:r>
           </w:p>
         </w:tc>
         <w:tc>
           <w:tcPr>
-            <w:tcW w:w="2670" w:type="dxa"/>
+            <w:tcW w:w="2606" w:type="dxa"/>
             <w:vAlign w:val="center"/>
           </w:tcPr>
           <w:p>
-            <w:r>
+            <w:pPr>
+              <w:rPr>
+                <w:rFonts w:ascii="Arial" w:hAnsi="Arial" w:cs="Arial"/>
+              </w:rPr>
+            </w:pPr>
+            <w:r>
+              <w:rPr>
+                <w:rFonts w:ascii="Arial" w:hAnsi="Arial" w:cs="Arial"/>
+              </w:rPr>
               <w:t>STATUS/RESOLUÇÃO</w:t>
             </w:r>
           </w:p>
@@ -938,14 +1263,31 @@
       <w:tr>
         <w:tc>
           <w:tcPr>
-            <w:tcW w:w="2715" w:type="dxa"/>
+            <w:tcW w:w="1555" w:type="dxa"/>
             <w:vAlign w:val="center"/>
           </w:tcPr>
           <w:p>
-            <w:r>
+            <w:pPr>
+              <w:rPr>
+                <w:rFonts w:ascii="Arial" w:hAnsi="Arial" w:cs="Arial"/>
+                <w:sz w:val="22"/>
+                <w:szCs w:val="22"/>
+              </w:rPr>
+            </w:pPr>
+            <w:r>
+              <w:rPr>
+                <w:rFonts w:ascii="Arial" w:hAnsi="Arial" w:cs="Arial"/>
+                <w:sz w:val="22"/>
+                <w:szCs w:val="22"/>
+              </w:rPr>
               <w:t>{#lista_ocorrencias_mes}</w:t>
             </w:r>
             <w:r>
+              <w:rPr>
+                <w:rFonts w:ascii="Arial" w:hAnsi="Arial" w:cs="Arial"/>
+                <w:sz w:val="22"/>
+                <w:szCs w:val="22"/>
+              </w:rPr>
               <w:br/>
               <w:t>{data}</w:t>
             </w:r>
@@ -953,47 +1295,170 @@
         </w:tc>
         <w:tc>
           <w:tcPr>
-            <w:tcW w:w="1478" w:type="dxa"/>
+            <w:tcW w:w="2126" w:type="dxa"/>
             <w:vAlign w:val="center"/>
           </w:tcPr>
           <w:p>
-            <w:r>
-              <w:t>{linha_rota}</w:t>
+            <w:pPr>
+              <w:rPr>
+                <w:rFonts w:ascii="Arial" w:hAnsi="Arial" w:cs="Arial"/>
+                <w:sz w:val="22"/>
+                <w:szCs w:val="22"/>
+              </w:rPr>
+            </w:pPr>
+            <w:r>
+              <w:rPr>
+                <w:rFonts w:ascii="Arial" w:hAnsi="Arial" w:cs="Arial"/>
+                <w:sz w:val="22"/>
+                <w:szCs w:val="22"/>
+              </w:rPr>
+              <w:t>{</w:t>
+            </w:r>
+            <w:proofErr w:type="spellStart"/>
+            <w:r>
+              <w:rPr>
+                <w:rFonts w:ascii="Arial" w:hAnsi="Arial" w:cs="Arial"/>
+                <w:sz w:val="22"/>
+                <w:szCs w:val="22"/>
+              </w:rPr>
+              <w:t>linha_rota</w:t>
+            </w:r>
+            <w:proofErr w:type="spellEnd"/>
+            <w:r>
+              <w:rPr>
+                <w:rFonts w:ascii="Arial" w:hAnsi="Arial" w:cs="Arial"/>
+                <w:sz w:val="22"/>
+                <w:szCs w:val="22"/>
+              </w:rPr>
+              <w:t>}</w:t>
             </w:r>
           </w:p>
         </w:tc>
         <w:tc>
           <w:tcPr>
-            <w:tcW w:w="1631" w:type="dxa"/>
+            <w:tcW w:w="2207" w:type="dxa"/>
             <w:vAlign w:val="center"/>
           </w:tcPr>
           <w:p>
-            <w:r>
-              <w:t>{descricao}</w:t>
+            <w:pPr>
+              <w:rPr>
+                <w:rFonts w:ascii="Arial" w:hAnsi="Arial" w:cs="Arial"/>
+                <w:sz w:val="22"/>
+                <w:szCs w:val="22"/>
+              </w:rPr>
+            </w:pPr>
+            <w:r>
+              <w:rPr>
+                <w:rFonts w:ascii="Arial" w:hAnsi="Arial" w:cs="Arial"/>
+                <w:sz w:val="22"/>
+                <w:szCs w:val="22"/>
+              </w:rPr>
+              <w:t>{</w:t>
+            </w:r>
+            <w:proofErr w:type="spellStart"/>
+            <w:r>
+              <w:rPr>
+                <w:rFonts w:ascii="Arial" w:hAnsi="Arial" w:cs="Arial"/>
+                <w:sz w:val="22"/>
+                <w:szCs w:val="22"/>
+              </w:rPr>
+              <w:t>descricao</w:t>
+            </w:r>
+            <w:proofErr w:type="spellEnd"/>
+            <w:r>
+              <w:rPr>
+                <w:rFonts w:ascii="Arial" w:hAnsi="Arial" w:cs="Arial"/>
+                <w:sz w:val="22"/>
+                <w:szCs w:val="22"/>
+              </w:rPr>
+              <w:t>}</w:t>
             </w:r>
           </w:p>
         </w:tc>
         <w:tc>
           <w:tcPr>
-            <w:tcW w:w="2670" w:type="dxa"/>
+            <w:tcW w:w="2606" w:type="dxa"/>
             <w:vAlign w:val="center"/>
           </w:tcPr>
           <w:p>
-            <w:r>
+            <w:pPr>
+              <w:rPr>
+                <w:rFonts w:ascii="Arial" w:hAnsi="Arial" w:cs="Arial"/>
+                <w:sz w:val="22"/>
+                <w:szCs w:val="22"/>
+              </w:rPr>
+            </w:pPr>
+            <w:r>
+              <w:rPr>
+                <w:rFonts w:ascii="Arial" w:hAnsi="Arial" w:cs="Arial"/>
+                <w:sz w:val="22"/>
+                <w:szCs w:val="22"/>
+              </w:rPr>
               <w:t>{status}</w:t>
             </w:r>
             <w:r>
+              <w:rPr>
+                <w:rFonts w:ascii="Arial" w:hAnsi="Arial" w:cs="Arial"/>
+                <w:sz w:val="22"/>
+                <w:szCs w:val="22"/>
+              </w:rPr>
               <w:br/>
-              <w:t>{/lista_ocorrencias_mes}</w:t>
+              <w:t>{/</w:t>
+            </w:r>
+            <w:proofErr w:type="spellStart"/>
+            <w:r>
+              <w:rPr>
+                <w:rFonts w:ascii="Arial" w:hAnsi="Arial" w:cs="Arial"/>
+                <w:sz w:val="22"/>
+                <w:szCs w:val="22"/>
+              </w:rPr>
+              <w:t>lista_ocorrencias_mes</w:t>
+            </w:r>
+            <w:proofErr w:type="spellEnd"/>
+            <w:r>
+              <w:rPr>
+                <w:rFonts w:ascii="Arial" w:hAnsi="Arial" w:cs="Arial"/>
+                <w:sz w:val="22"/>
+                <w:szCs w:val="22"/>
+              </w:rPr>
+              <w:t>}</w:t>
             </w:r>
           </w:p>
         </w:tc>
       </w:tr>
     </w:tbl>
-    <w:p/>
-    <w:p>
-      <w:r>
-        <w:t>{/meses}`**</w:t>
+    <w:p>
+      <w:pPr>
+        <w:rPr>
+          <w:rFonts w:ascii="Arial" w:hAnsi="Arial" w:cs="Arial"/>
+        </w:rPr>
+      </w:pPr>
+    </w:p>
+    <w:p>
+      <w:pPr>
+        <w:rPr>
+          <w:rFonts w:ascii="Arial" w:hAnsi="Arial" w:cs="Arial"/>
+        </w:rPr>
+      </w:pPr>
+      <w:r>
+        <w:rPr>
+          <w:rFonts w:ascii="Arial" w:hAnsi="Arial" w:cs="Arial"/>
+        </w:rPr>
+        <w:t>{/</w:t>
+      </w:r>
+      <w:proofErr w:type="gramStart"/>
+      <w:r>
+        <w:rPr>
+          <w:rFonts w:ascii="Arial" w:hAnsi="Arial" w:cs="Arial"/>
+        </w:rPr>
+        <w:t>meses}`</w:t>
+      </w:r>
+      <w:proofErr w:type="gramEnd"/>
+      <w:r>
+        <w:rPr>
+          <w:rFonts w:ascii="Arial" w:hAnsi="Arial" w:cs="Arial"/>
+        </w:rPr>
+        <w:t>**</w:t>
       </w:r>
     </w:p>
     <w:sectPr>

</xml_diff>

<commit_message>
update: atualiza layout do template_geral denovo
</commit_message>
<xml_diff>
--- a/template_geral.docx
+++ b/template_geral.docx
@@ -1178,9 +1178,8 @@
       </w:tblPr>
       <w:tblGrid>
         <w:gridCol w:w="1555"/>
-        <w:gridCol w:w="2126"/>
-        <w:gridCol w:w="2207"/>
-        <w:gridCol w:w="2606"/>
+        <w:gridCol w:w="3260"/>
+        <w:gridCol w:w="3544"/>
       </w:tblGrid>
       <w:tr>
         <w:tc>
@@ -1204,26 +1203,7 @@
         </w:tc>
         <w:tc>
           <w:tcPr>
-            <w:tcW w:w="2126" w:type="dxa"/>
-            <w:vAlign w:val="center"/>
-          </w:tcPr>
-          <w:p>
-            <w:pPr>
-              <w:rPr>
-                <w:rFonts w:ascii="Arial" w:hAnsi="Arial" w:cs="Arial"/>
-              </w:rPr>
-            </w:pPr>
-            <w:r>
-              <w:rPr>
-                <w:rFonts w:ascii="Arial" w:hAnsi="Arial" w:cs="Arial"/>
-              </w:rPr>
-              <w:t>LINHA/ROTA</w:t>
-            </w:r>
-          </w:p>
-        </w:tc>
-        <w:tc>
-          <w:tcPr>
-            <w:tcW w:w="2207" w:type="dxa"/>
+            <w:tcW w:w="3260" w:type="dxa"/>
             <w:vAlign w:val="center"/>
           </w:tcPr>
           <w:p>
@@ -1242,7 +1222,7 @@
         </w:tc>
         <w:tc>
           <w:tcPr>
-            <w:tcW w:w="2606" w:type="dxa"/>
+            <w:tcW w:w="3544" w:type="dxa"/>
             <w:vAlign w:val="center"/>
           </w:tcPr>
           <w:p>
@@ -1295,7 +1275,7 @@
         </w:tc>
         <w:tc>
           <w:tcPr>
-            <w:tcW w:w="2126" w:type="dxa"/>
+            <w:tcW w:w="3260" w:type="dxa"/>
             <w:vAlign w:val="center"/>
           </w:tcPr>
           <w:p>
@@ -1321,7 +1301,7 @@
                 <w:sz w:val="22"/>
                 <w:szCs w:val="22"/>
               </w:rPr>
-              <w:t>linha_rota</w:t>
+              <w:t>descricao</w:t>
             </w:r>
             <w:proofErr w:type="spellEnd"/>
             <w:r>
@@ -1336,48 +1316,7 @@
         </w:tc>
         <w:tc>
           <w:tcPr>
-            <w:tcW w:w="2207" w:type="dxa"/>
-            <w:vAlign w:val="center"/>
-          </w:tcPr>
-          <w:p>
-            <w:pPr>
-              <w:rPr>
-                <w:rFonts w:ascii="Arial" w:hAnsi="Arial" w:cs="Arial"/>
-                <w:sz w:val="22"/>
-                <w:szCs w:val="22"/>
-              </w:rPr>
-            </w:pPr>
-            <w:r>
-              <w:rPr>
-                <w:rFonts w:ascii="Arial" w:hAnsi="Arial" w:cs="Arial"/>
-                <w:sz w:val="22"/>
-                <w:szCs w:val="22"/>
-              </w:rPr>
-              <w:t>{</w:t>
-            </w:r>
-            <w:proofErr w:type="spellStart"/>
-            <w:r>
-              <w:rPr>
-                <w:rFonts w:ascii="Arial" w:hAnsi="Arial" w:cs="Arial"/>
-                <w:sz w:val="22"/>
-                <w:szCs w:val="22"/>
-              </w:rPr>
-              <w:t>descricao</w:t>
-            </w:r>
-            <w:proofErr w:type="spellEnd"/>
-            <w:r>
-              <w:rPr>
-                <w:rFonts w:ascii="Arial" w:hAnsi="Arial" w:cs="Arial"/>
-                <w:sz w:val="22"/>
-                <w:szCs w:val="22"/>
-              </w:rPr>
-              <w:t>}</w:t>
-            </w:r>
-          </w:p>
-        </w:tc>
-        <w:tc>
-          <w:tcPr>
-            <w:tcW w:w="2606" w:type="dxa"/>
+            <w:tcW w:w="3544" w:type="dxa"/>
             <w:vAlign w:val="center"/>
           </w:tcPr>
           <w:p>
@@ -1438,11 +1377,15 @@
       <w:pPr>
         <w:rPr>
           <w:rFonts w:ascii="Arial" w:hAnsi="Arial" w:cs="Arial"/>
+          <w:b/>
+          <w:bCs/>
         </w:rPr>
       </w:pPr>
       <w:r>
         <w:rPr>
           <w:rFonts w:ascii="Arial" w:hAnsi="Arial" w:cs="Arial"/>
+          <w:b/>
+          <w:bCs/>
         </w:rPr>
         <w:t>{/</w:t>
       </w:r>
@@ -1450,6 +1393,8 @@
       <w:r>
         <w:rPr>
           <w:rFonts w:ascii="Arial" w:hAnsi="Arial" w:cs="Arial"/>
+          <w:b/>
+          <w:bCs/>
         </w:rPr>
         <w:t>meses}`</w:t>
       </w:r>
@@ -1457,6 +1402,8 @@
       <w:r>
         <w:rPr>
           <w:rFonts w:ascii="Arial" w:hAnsi="Arial" w:cs="Arial"/>
+          <w:b/>
+          <w:bCs/>
         </w:rPr>
         <w:t>**</w:t>
       </w:r>

</xml_diff>

<commit_message>
chore: remove logo configurations from SLA reports
</commit_message>
<xml_diff>
--- a/template_geral.docx
+++ b/template_geral.docx
@@ -44,25 +44,7 @@
           <w:b/>
           <w:bCs/>
         </w:rPr>
-        <w:t>{</w:t>
-      </w:r>
-      <w:proofErr w:type="spellStart"/>
-      <w:r>
-        <w:rPr>
-          <w:rFonts w:ascii="Arial" w:hAnsi="Arial" w:cs="Arial"/>
-          <w:b/>
-          <w:bCs/>
-        </w:rPr>
-        <w:t>nome_cliente</w:t>
-      </w:r>
-      <w:proofErr w:type="spellEnd"/>
-      <w:r>
-        <w:rPr>
-          <w:rFonts w:ascii="Arial" w:hAnsi="Arial" w:cs="Arial"/>
-          <w:b/>
-          <w:bCs/>
-        </w:rPr>
-        <w:t>}</w:t>
+        <w:t>{nome_cliente}</w:t>
       </w:r>
     </w:p>
     <w:p>
@@ -137,21 +119,7 @@
         <w:rPr>
           <w:rFonts w:ascii="Arial" w:hAnsi="Arial" w:cs="Arial"/>
         </w:rPr>
-        <w:t>Escopo: Operação de {rotas} rotas mensais {</w:t>
-      </w:r>
-      <w:proofErr w:type="spellStart"/>
-      <w:r>
-        <w:rPr>
-          <w:rFonts w:ascii="Arial" w:hAnsi="Arial" w:cs="Arial"/>
-        </w:rPr>
-        <w:t>mes</w:t>
-      </w:r>
-      <w:proofErr w:type="spellEnd"/>
-      <w:r>
-        <w:rPr>
-          <w:rFonts w:ascii="Arial" w:hAnsi="Arial" w:cs="Arial"/>
-        </w:rPr>
-        <w:t>}</w:t>
+        <w:t>Escopo: Operação de {rotas} rotas mensais {mes}</w:t>
       </w:r>
     </w:p>
     <w:p>
@@ -396,35 +364,7 @@
                 <w:b/>
                 <w:bCs/>
               </w:rPr>
-              <w:t>({</w:t>
-            </w:r>
-            <w:proofErr w:type="spellStart"/>
-            <w:proofErr w:type="gramStart"/>
-            <w:r>
-              <w:rPr>
-                <w:rFonts w:ascii="Arial" w:eastAsia="Arial" w:hAnsi="Arial" w:cs="Arial"/>
-                <w:b/>
-                <w:bCs/>
-              </w:rPr>
-              <w:t>media</w:t>
-            </w:r>
-            <w:proofErr w:type="gramEnd"/>
-            <w:r>
-              <w:rPr>
-                <w:rFonts w:ascii="Arial" w:eastAsia="Arial" w:hAnsi="Arial" w:cs="Arial"/>
-                <w:b/>
-                <w:bCs/>
-              </w:rPr>
-              <w:t>_rotas</w:t>
-            </w:r>
-            <w:proofErr w:type="spellEnd"/>
-            <w:r>
-              <w:rPr>
-                <w:rFonts w:ascii="Arial" w:eastAsia="Arial" w:hAnsi="Arial" w:cs="Arial"/>
-                <w:b/>
-                <w:bCs/>
-              </w:rPr>
-              <w:t>} rotas)</w:t>
+              <w:t>({media_rotas} rotas)</w:t>
             </w:r>
           </w:p>
         </w:tc>
@@ -534,25 +474,7 @@
                 <w:b/>
                 <w:bCs/>
               </w:rPr>
-              <w:t>Até {</w:t>
-            </w:r>
-            <w:proofErr w:type="spellStart"/>
-            <w:r>
-              <w:rPr>
-                <w:rFonts w:ascii="Arial" w:eastAsia="Arial" w:hAnsi="Arial" w:cs="Arial"/>
-                <w:b/>
-                <w:bCs/>
-              </w:rPr>
-              <w:t>tolerancia_ocorrencias</w:t>
-            </w:r>
-            <w:proofErr w:type="spellEnd"/>
-            <w:r>
-              <w:rPr>
-                <w:rFonts w:ascii="Arial" w:eastAsia="Arial" w:hAnsi="Arial" w:cs="Arial"/>
-                <w:b/>
-                <w:bCs/>
-              </w:rPr>
-              <w:t>} ocorrências</w:t>
+              <w:t>Até {tolerancia_ocorrencias} ocorrências</w:t>
             </w:r>
           </w:p>
         </w:tc>
@@ -662,25 +584,7 @@
                 <w:b/>
                 <w:bCs/>
               </w:rPr>
-              <w:t>Até {</w:t>
-            </w:r>
-            <w:proofErr w:type="spellStart"/>
-            <w:r>
-              <w:rPr>
-                <w:rFonts w:ascii="Arial" w:eastAsia="Arial" w:hAnsi="Arial" w:cs="Arial"/>
-                <w:b/>
-                <w:bCs/>
-              </w:rPr>
-              <w:t>meta_ocorrencias</w:t>
-            </w:r>
-            <w:proofErr w:type="spellEnd"/>
-            <w:r>
-              <w:rPr>
-                <w:rFonts w:ascii="Arial" w:eastAsia="Arial" w:hAnsi="Arial" w:cs="Arial"/>
-                <w:b/>
-                <w:bCs/>
-              </w:rPr>
-              <w:t>} ocorrências</w:t>
+              <w:t>Até {meta_ocorrencias} ocorrências</w:t>
             </w:r>
           </w:p>
         </w:tc>
@@ -794,25 +698,7 @@
           <w:b/>
           <w:bCs/>
         </w:rPr>
-        <w:t xml:space="preserve">Padrões de </w:t>
-      </w:r>
-      <w:proofErr w:type="spellStart"/>
-      <w:r>
-        <w:rPr>
-          <w:rFonts w:ascii="Arial" w:eastAsia="Arial" w:hAnsi="Arial" w:cs="Arial"/>
-          <w:b/>
-          <w:bCs/>
-        </w:rPr>
-        <w:t>Procurement</w:t>
-      </w:r>
-      <w:proofErr w:type="spellEnd"/>
-      <w:r>
-        <w:rPr>
-          <w:rFonts w:ascii="Arial" w:eastAsia="Arial" w:hAnsi="Arial" w:cs="Arial"/>
-          <w:b/>
-          <w:bCs/>
-        </w:rPr>
-        <w:t xml:space="preserve"> Corporativo (SLA):</w:t>
+        <w:t>Padrões de Procurement Corporativo (SLA):</w:t>
       </w:r>
       <w:r>
         <w:rPr>
@@ -906,35 +792,7 @@
           <w:b/>
           <w:bCs/>
         </w:rPr>
-        <w:t>({</w:t>
-      </w:r>
-      <w:proofErr w:type="spellStart"/>
-      <w:proofErr w:type="gramStart"/>
-      <w:r>
-        <w:rPr>
-          <w:rFonts w:ascii="Arial" w:eastAsia="Arial" w:hAnsi="Arial" w:cs="Arial"/>
-          <w:b/>
-          <w:bCs/>
-        </w:rPr>
-        <w:t>media</w:t>
-      </w:r>
-      <w:proofErr w:type="gramEnd"/>
-      <w:r>
-        <w:rPr>
-          <w:rFonts w:ascii="Arial" w:eastAsia="Arial" w:hAnsi="Arial" w:cs="Arial"/>
-          <w:b/>
-          <w:bCs/>
-        </w:rPr>
-        <w:t>_rotas</w:t>
-      </w:r>
-      <w:proofErr w:type="spellEnd"/>
-      <w:r>
-        <w:rPr>
-          <w:rFonts w:ascii="Arial" w:eastAsia="Arial" w:hAnsi="Arial" w:cs="Arial"/>
-          <w:b/>
-          <w:bCs/>
-        </w:rPr>
-        <w:t>} rotas)</w:t>
+        <w:t>({media_rotas} rotas)</w:t>
       </w:r>
       <w:r>
         <w:rPr>
@@ -946,30 +804,8 @@
         <w:rPr>
           <w:rFonts w:ascii="Arial" w:eastAsia="Arial" w:hAnsi="Arial" w:cs="Arial"/>
         </w:rPr>
-        <w:t>{</w:t>
-      </w:r>
-      <w:proofErr w:type="spellStart"/>
-      <w:r>
-        <w:rPr>
-          <w:rFonts w:ascii="Arial" w:eastAsia="Arial" w:hAnsi="Arial" w:cs="Arial"/>
-        </w:rPr>
-        <w:t>peso_</w:t>
-      </w:r>
-      <w:proofErr w:type="gramStart"/>
-      <w:r>
-        <w:rPr>
-          <w:rFonts w:ascii="Arial" w:eastAsia="Arial" w:hAnsi="Arial" w:cs="Arial"/>
-        </w:rPr>
-        <w:t>estatistico</w:t>
-      </w:r>
-      <w:proofErr w:type="spellEnd"/>
-      <w:r>
-        <w:rPr>
-          <w:rFonts w:ascii="Arial" w:eastAsia="Arial" w:hAnsi="Arial" w:cs="Arial"/>
-        </w:rPr>
-        <w:t>}%</w:t>
-      </w:r>
-      <w:proofErr w:type="gramEnd"/>
+        <w:t>{peso_estatistico}%</w:t>
+      </w:r>
       <w:r>
         <w:rPr>
           <w:rFonts w:ascii="Arial" w:eastAsia="Arial" w:hAnsi="Arial" w:cs="Arial"/>
@@ -1019,25 +855,7 @@
           <w:b/>
           <w:bCs/>
         </w:rPr>
-        <w:t>{#meses} {</w:t>
-      </w:r>
-      <w:proofErr w:type="spellStart"/>
-      <w:r>
-        <w:rPr>
-          <w:rFonts w:ascii="Arial" w:eastAsia="Arial" w:hAnsi="Arial" w:cs="Arial"/>
-          <w:b/>
-          <w:bCs/>
-        </w:rPr>
-        <w:t>mes</w:t>
-      </w:r>
-      <w:proofErr w:type="spellEnd"/>
-      <w:r>
-        <w:rPr>
-          <w:rFonts w:ascii="Arial" w:eastAsia="Arial" w:hAnsi="Arial" w:cs="Arial"/>
-          <w:b/>
-          <w:bCs/>
-        </w:rPr>
-        <w:t>} </w:t>
+        <w:t>{#meses} {mes} </w:t>
       </w:r>
     </w:p>
     <w:p>
@@ -1054,25 +872,24 @@
           <w:sz w:val="22"/>
           <w:szCs w:val="22"/>
         </w:rPr>
-        <w:t>NÚMERO DE OCORRÊNCIAS: {</w:t>
-      </w:r>
-      <w:proofErr w:type="spellStart"/>
-      <w:r>
+        <w:t>NÚMERO DE OCORRÊNCIAS: {ocorrencias} </w:t>
+      </w:r>
+    </w:p>
+    <w:p>
+      <w:pPr>
         <w:rPr>
           <w:rFonts w:ascii="Arial" w:eastAsia="Arial" w:hAnsi="Arial" w:cs="Arial"/>
           <w:sz w:val="22"/>
           <w:szCs w:val="22"/>
         </w:rPr>
-        <w:t>ocorrencias</w:t>
-      </w:r>
-      <w:proofErr w:type="spellEnd"/>
+      </w:pPr>
       <w:r>
         <w:rPr>
           <w:rFonts w:ascii="Arial" w:eastAsia="Arial" w:hAnsi="Arial" w:cs="Arial"/>
           <w:sz w:val="22"/>
           <w:szCs w:val="22"/>
         </w:rPr>
-        <w:t>} </w:t>
+        <w:t>OCORRÊNCIA GERAL: {meta} </w:t>
       </w:r>
     </w:p>
     <w:p>
@@ -1089,7 +906,7 @@
           <w:sz w:val="22"/>
           <w:szCs w:val="22"/>
         </w:rPr>
-        <w:t>OCORRÊNCIA GERAL: {meta} </w:t>
+        <w:t>Classificação: {nivel}</w:t>
       </w:r>
     </w:p>
     <w:p>
@@ -1106,60 +923,7 @@
           <w:sz w:val="22"/>
           <w:szCs w:val="22"/>
         </w:rPr>
-        <w:t>Classificação: {</w:t>
-      </w:r>
-      <w:proofErr w:type="spellStart"/>
-      <w:r>
-        <w:rPr>
-          <w:rFonts w:ascii="Arial" w:eastAsia="Arial" w:hAnsi="Arial" w:cs="Arial"/>
-          <w:sz w:val="22"/>
-          <w:szCs w:val="22"/>
-        </w:rPr>
-        <w:t>nivel</w:t>
-      </w:r>
-      <w:proofErr w:type="spellEnd"/>
-      <w:r>
-        <w:rPr>
-          <w:rFonts w:ascii="Arial" w:eastAsia="Arial" w:hAnsi="Arial" w:cs="Arial"/>
-          <w:sz w:val="22"/>
-          <w:szCs w:val="22"/>
-        </w:rPr>
-        <w:t>}</w:t>
-      </w:r>
-    </w:p>
-    <w:p>
-      <w:pPr>
-        <w:rPr>
-          <w:rFonts w:ascii="Arial" w:eastAsia="Arial" w:hAnsi="Arial" w:cs="Arial"/>
-          <w:sz w:val="22"/>
-          <w:szCs w:val="22"/>
-        </w:rPr>
-      </w:pPr>
-      <w:r>
-        <w:rPr>
-          <w:rFonts w:ascii="Arial" w:eastAsia="Arial" w:hAnsi="Arial" w:cs="Arial"/>
-          <w:sz w:val="22"/>
-          <w:szCs w:val="22"/>
-        </w:rPr>
-        <w:t>DETALHAMENTO DE OCORRÊNCIAS: {</w:t>
-      </w:r>
-      <w:proofErr w:type="spellStart"/>
-      <w:r>
-        <w:rPr>
-          <w:rFonts w:ascii="Arial" w:eastAsia="Arial" w:hAnsi="Arial" w:cs="Arial"/>
-          <w:sz w:val="22"/>
-          <w:szCs w:val="22"/>
-        </w:rPr>
-        <w:t>mes</w:t>
-      </w:r>
-      <w:proofErr w:type="spellEnd"/>
-      <w:r>
-        <w:rPr>
-          <w:rFonts w:ascii="Arial" w:eastAsia="Arial" w:hAnsi="Arial" w:cs="Arial"/>
-          <w:sz w:val="22"/>
-          <w:szCs w:val="22"/>
-        </w:rPr>
-        <w:t>}</w:t>
+        <w:t>DETALHAMENTO DE OCORRÊNCIAS: {mes}</w:t>
       </w:r>
     </w:p>
     <w:p>
@@ -1292,25 +1056,7 @@
                 <w:sz w:val="22"/>
                 <w:szCs w:val="22"/>
               </w:rPr>
-              <w:t>{</w:t>
-            </w:r>
-            <w:proofErr w:type="spellStart"/>
-            <w:r>
-              <w:rPr>
-                <w:rFonts w:ascii="Arial" w:hAnsi="Arial" w:cs="Arial"/>
-                <w:sz w:val="22"/>
-                <w:szCs w:val="22"/>
-              </w:rPr>
-              <w:t>descricao</w:t>
-            </w:r>
-            <w:proofErr w:type="spellEnd"/>
-            <w:r>
-              <w:rPr>
-                <w:rFonts w:ascii="Arial" w:hAnsi="Arial" w:cs="Arial"/>
-                <w:sz w:val="22"/>
-                <w:szCs w:val="22"/>
-              </w:rPr>
-              <w:t>}</w:t>
+              <w:t>{descricao}</w:t>
             </w:r>
           </w:p>
         </w:tc>
@@ -1342,25 +1088,7 @@
                 <w:szCs w:val="22"/>
               </w:rPr>
               <w:br/>
-              <w:t>{/</w:t>
-            </w:r>
-            <w:proofErr w:type="spellStart"/>
-            <w:r>
-              <w:rPr>
-                <w:rFonts w:ascii="Arial" w:hAnsi="Arial" w:cs="Arial"/>
-                <w:sz w:val="22"/>
-                <w:szCs w:val="22"/>
-              </w:rPr>
-              <w:t>lista_ocorrencias_mes</w:t>
-            </w:r>
-            <w:proofErr w:type="spellEnd"/>
-            <w:r>
-              <w:rPr>
-                <w:rFonts w:ascii="Arial" w:hAnsi="Arial" w:cs="Arial"/>
-                <w:sz w:val="22"/>
-                <w:szCs w:val="22"/>
-              </w:rPr>
-              <w:t>}</w:t>
+              <w:t>{/lista_ocorrencias_mes}</w:t>
             </w:r>
           </w:p>
         </w:tc>
@@ -1387,25 +1115,7 @@
           <w:b/>
           <w:bCs/>
         </w:rPr>
-        <w:t>{/</w:t>
-      </w:r>
-      <w:proofErr w:type="gramStart"/>
-      <w:r>
-        <w:rPr>
-          <w:rFonts w:ascii="Arial" w:hAnsi="Arial" w:cs="Arial"/>
-          <w:b/>
-          <w:bCs/>
-        </w:rPr>
-        <w:t>meses}`</w:t>
-      </w:r>
-      <w:proofErr w:type="gramEnd"/>
-      <w:r>
-        <w:rPr>
-          <w:rFonts w:ascii="Arial" w:hAnsi="Arial" w:cs="Arial"/>
-          <w:b/>
-          <w:bCs/>
-        </w:rPr>
-        <w:t>**</w:t>
+        <w:t>{/meses}`**</w:t>
       </w:r>
     </w:p>
     <w:sectPr>
@@ -1472,9 +1182,6 @@
 <file path=word/header1.xml><?xml version="1.0" encoding="utf-8"?>
 <w:hdr xmlns:wpc="http://schemas.microsoft.com/office/word/2010/wordprocessingCanvas" xmlns:cx="http://schemas.microsoft.com/office/drawing/2014/chartex" xmlns:cx1="http://schemas.microsoft.com/office/drawing/2015/9/8/chartex" xmlns:cx2="http://schemas.microsoft.com/office/drawing/2015/10/21/chartex" xmlns:cx3="http://schemas.microsoft.com/office/drawing/2016/5/9/chartex" xmlns:cx4="http://schemas.microsoft.com/office/drawing/2016/5/10/chartex" xmlns:cx5="http://schemas.microsoft.com/office/drawing/2016/5/11/chartex" xmlns:cx6="http://schemas.microsoft.com/office/drawing/2016/5/12/chartex" xmlns:cx7="http://schemas.microsoft.com/office/drawing/2016/5/13/chartex" xmlns:cx8="http://schemas.microsoft.com/office/drawing/2016/5/14/chartex" xmlns:mc="http://schemas.openxmlformats.org/markup-compatibility/2006" xmlns:aink="http://schemas.microsoft.com/office/drawing/2016/ink" xmlns:am3d="http://schemas.microsoft.com/office/drawing/2017/model3d" xmlns:o="urn:schemas-microsoft-com:office:office" xmlns:oel="http://schemas.microsoft.com/office/2019/extlst" xmlns:r="http://schemas.openxmlformats.org/officeDocument/2006/relationships" xmlns:m="http://schemas.openxmlformats.org/officeDocument/2006/math" xmlns:v="urn:schemas-microsoft-com:vml" xmlns:wp14="http://schemas.microsoft.com/office/word/2010/wordprocessingDrawing" xmlns:wp="http://schemas.openxmlformats.org/drawingml/2006/wordprocessingDrawing" xmlns:w10="urn:schemas-microsoft-com:office:word" xmlns:w="http://schemas.openxmlformats.org/wordprocessingml/2006/main" xmlns:w14="http://schemas.microsoft.com/office/word/2010/wordml" xmlns:w15="http://schemas.microsoft.com/office/word/2012/wordml" xmlns:w16cex="http://schemas.microsoft.com/office/word/2018/wordml/cex" xmlns:w16cid="http://schemas.microsoft.com/office/word/2016/wordml/cid" xmlns:w16="http://schemas.microsoft.com/office/word/2018/wordml" xmlns:w16du="http://schemas.microsoft.com/office/word/2023/wordml/word16du" xmlns:w16sdtdh="http://schemas.microsoft.com/office/word/2020/wordml/sdtdatahash" xmlns:w16sdtfl="http://schemas.microsoft.com/office/word/2024/wordml/sdtformatlock" xmlns:w16se="http://schemas.microsoft.com/office/word/2015/wordml/symex" xmlns:wpg="http://schemas.microsoft.com/office/word/2010/wordprocessingGroup" xmlns:wpi="http://schemas.microsoft.com/office/word/2010/wordprocessingInk" xmlns:wne="http://schemas.microsoft.com/office/word/2006/wordml" xmlns:wps="http://schemas.microsoft.com/office/word/2010/wordprocessingShape" mc:Ignorable="w14 w15 w16se w16cid w16 w16cex w16sdtdh w16sdtfl w16du wp14">
   <w:p>
-    <w:r>
-      <w:t>{%logo}</w:t>
-    </w:r>
     <w:r>
       <w:rPr>
         <w:noProof/>

</xml_diff>